<commit_message>
docs: add Docker contribution statement with IEEE references
</commit_message>
<xml_diff>
--- a/docs/Word Document/CLDV6212_Part_1.docx
+++ b/docs/Word Document/CLDV6212_Part_1.docx
@@ -2715,8 +2715,29 @@
             <w:hideMark/>
           </w:tcPr>
           <w:p>
-            <w:r>
-              <w:t>MenuItem model, all 5 Menu HTTP functions (Create, GetAll, GetByCategory, Update, Delete), README</w:t>
+            <w:proofErr w:type="spellStart"/>
+            <w:r>
+              <w:t>MenuItem</w:t>
+            </w:r>
+            <w:proofErr w:type="spellEnd"/>
+            <w:r>
+              <w:t xml:space="preserve"> model, all 5 Menu HTTP functions (Create, </w:t>
+            </w:r>
+            <w:proofErr w:type="spellStart"/>
+            <w:r>
+              <w:t>GetAll</w:t>
+            </w:r>
+            <w:proofErr w:type="spellEnd"/>
+            <w:r>
+              <w:t xml:space="preserve">, </w:t>
+            </w:r>
+            <w:proofErr w:type="spellStart"/>
+            <w:r>
+              <w:t>GetByCategory</w:t>
+            </w:r>
+            <w:proofErr w:type="spellEnd"/>
+            <w:r>
+              <w:t>, Update, Delete), README</w:t>
             </w:r>
           </w:p>
         </w:tc>
@@ -2817,8 +2838,29 @@
             <w:hideMark/>
           </w:tcPr>
           <w:p>
-            <w:r>
-              <w:t>UploadStaffDocument, ListStaffDocuments, DownloadStaffDocument functions</w:t>
+            <w:proofErr w:type="spellStart"/>
+            <w:r>
+              <w:t>UploadStaffDocument</w:t>
+            </w:r>
+            <w:proofErr w:type="spellEnd"/>
+            <w:r>
+              <w:t xml:space="preserve">, </w:t>
+            </w:r>
+            <w:proofErr w:type="spellStart"/>
+            <w:r>
+              <w:t>ListStaffDocuments</w:t>
+            </w:r>
+            <w:proofErr w:type="spellEnd"/>
+            <w:r>
+              <w:t xml:space="preserve">, </w:t>
+            </w:r>
+            <w:proofErr w:type="spellStart"/>
+            <w:r>
+              <w:t>DownloadStaffDocument</w:t>
+            </w:r>
+            <w:proofErr w:type="spellEnd"/>
+            <w:r>
+              <w:t xml:space="preserve"> functions</w:t>
             </w:r>
           </w:p>
         </w:tc>
@@ -2919,8 +2961,13 @@
             <w:hideMark/>
           </w:tcPr>
           <w:p>
-            <w:r>
-              <w:t>Dockerfile, Docker Hub image publishing, Azurite container setup</w:t>
+            <w:proofErr w:type="spellStart"/>
+            <w:r>
+              <w:t>Dockerfile</w:t>
+            </w:r>
+            <w:proofErr w:type="spellEnd"/>
+            <w:r>
+              <w:t>, Docker Hub image publishing, Azurite container setup</w:t>
             </w:r>
           </w:p>
         </w:tc>
@@ -2969,7 +3016,15 @@
         <w:t>s</w:t>
       </w:r>
       <w:r>
-        <w:t>e CoffeeNChill’s chalkboard menu for their coffee shop. With five HTTP triggered Azure Functions that handle full CRUD operations of the menu items (creating, reading, updating, and deleting): create a new menu item</w:t>
+        <w:t xml:space="preserve">e </w:t>
+      </w:r>
+      <w:proofErr w:type="spellStart"/>
+      <w:r>
+        <w:t>CoffeeNChill’s</w:t>
+      </w:r>
+      <w:proofErr w:type="spellEnd"/>
+      <w:r>
+        <w:t xml:space="preserve"> chalkboard menu for their coffee shop. With five HTTP triggered Azure Functions that handle full CRUD operations of the menu items (creating, reading, updating, and deleting): create a new menu item</w:t>
       </w:r>
       <w:r>
         <w:t xml:space="preserve"> </w:t>
@@ -2979,6 +3034,7 @@
           <w:id w:val="49356181"/>
           <w:citation/>
         </w:sdtPr>
+        <w:sdtEndPr/>
         <w:sdtContent>
           <w:r>
             <w:fldChar w:fldCharType="begin"/>
@@ -3014,6 +3070,7 @@
           <w:id w:val="-216895064"/>
           <w:citation/>
         </w:sdtPr>
+        <w:sdtEndPr/>
         <w:sdtContent>
           <w:r>
             <w:fldChar w:fldCharType="begin"/>
@@ -3049,6 +3106,7 @@
           <w:id w:val="-1028261604"/>
           <w:citation/>
         </w:sdtPr>
+        <w:sdtEndPr/>
         <w:sdtContent>
           <w:r>
             <w:fldChar w:fldCharType="begin"/>
@@ -3078,6 +3136,7 @@
           <w:id w:val="906724845"/>
           <w:citation/>
         </w:sdtPr>
+        <w:sdtEndPr/>
         <w:sdtContent>
           <w:r>
             <w:fldChar w:fldCharType="begin"/>
@@ -3139,6 +3198,7 @@
           <w:id w:val="-1773160890"/>
           <w:citation/>
         </w:sdtPr>
+        <w:sdtEndPr/>
         <w:sdtContent>
           <w:r>
             <w:fldChar w:fldCharType="begin"/>
@@ -3179,6 +3239,7 @@
           <w:id w:val="-929119347"/>
           <w:citation/>
         </w:sdtPr>
+        <w:sdtEndPr/>
         <w:sdtContent>
           <w:r>
             <w:fldChar w:fldCharType="begin"/>
@@ -3210,6 +3271,7 @@
           <w:id w:val="612016295"/>
           <w:citation/>
         </w:sdtPr>
+        <w:sdtEndPr/>
         <w:sdtContent>
           <w:r>
             <w:fldChar w:fldCharType="begin"/>
@@ -3250,6 +3312,7 @@
           <w:id w:val="-16164434"/>
           <w:citation/>
         </w:sdtPr>
+        <w:sdtEndPr/>
         <w:sdtContent>
           <w:r>
             <w:fldChar w:fldCharType="begin"/>
@@ -3295,133 +3358,174 @@
       <w:bookmarkEnd w:id="6"/>
     </w:p>
     <w:p>
-      <w:r>
-        <w:t>References:</w:t>
-      </w:r>
-    </w:p>
-    <w:p>
       <w:pPr>
         <w:rPr>
-          <w:b/>
-          <w:bCs/>
+          <w:lang w:val="en-US"/>
         </w:rPr>
       </w:pPr>
+      <w:r>
+        <w:rPr>
+          <w:lang w:val="en-US"/>
+        </w:rPr>
+        <w:t>My contribution to Part 1 of the POE was the Docker setup. I wrote multi-stage Docker file for the Azure Functions project, the beginning stage used the full .NET 9 SDK image to compile and publish the code, the second stage then copied only the compiled output into the lightweight Azure Functions runtime image, keeping the final image small and clean</w:t>
+      </w:r>
+      <w:r>
+        <w:rPr>
+          <w:lang w:val="en-US"/>
+        </w:rPr>
+        <w:t xml:space="preserve"> </w:t>
+      </w:r>
       <w:sdt>
         <w:sdtPr>
-          <w:id w:val="-1104037068"/>
+          <w:rPr>
+            <w:lang w:val="en-US"/>
+          </w:rPr>
+          <w:id w:val="-1937205787"/>
           <w:citation/>
         </w:sdtPr>
         <w:sdtContent>
           <w:r>
+            <w:rPr>
+              <w:lang w:val="en-US"/>
+            </w:rPr>
             <w:fldChar w:fldCharType="begin"/>
           </w:r>
           <w:r>
-            <w:instrText xml:space="preserve">CITATION Mic5a \l 7177 </w:instrText>
-          </w:r>
-          <w:r>
+            <w:instrText xml:space="preserve"> CITATION Mic2624 \l 7177 </w:instrText>
+          </w:r>
+          <w:r>
+            <w:rPr>
+              <w:lang w:val="en-US"/>
+            </w:rPr>
             <w:fldChar w:fldCharType="separate"/>
           </w:r>
           <w:r>
             <w:rPr>
               <w:noProof/>
             </w:rPr>
-            <w:t>(Microsoft Learn, 2025a)</w:t>
-          </w:r>
-          <w:r>
+            <w:t>(Microsoft Learn, 2026a)</w:t>
+          </w:r>
+          <w:r>
+            <w:rPr>
+              <w:lang w:val="en-US"/>
+            </w:rPr>
             <w:fldChar w:fldCharType="end"/>
           </w:r>
         </w:sdtContent>
       </w:sdt>
       <w:r>
-        <w:t xml:space="preserve"> - </w:t>
-      </w:r>
-      <w:r>
         <w:rPr>
-          <w:b/>
-          <w:bCs/>
+          <w:lang w:val="en-US"/>
         </w:rPr>
-        <w:t>Install and run Azurite emulator</w:t>
-      </w:r>
-    </w:p>
-    <w:p>
-      <w:pPr>
-        <w:rPr>
-          <w:b/>
-          <w:bCs/>
-        </w:rPr>
-      </w:pPr>
+        <w:t xml:space="preserve"> </w:t>
+      </w:r>
       <w:sdt>
         <w:sdtPr>
-          <w:id w:val="-1349796472"/>
+          <w:rPr>
+            <w:lang w:val="en-US"/>
+          </w:rPr>
+          <w:id w:val="1572621156"/>
           <w:citation/>
         </w:sdtPr>
         <w:sdtContent>
           <w:r>
+            <w:rPr>
+              <w:lang w:val="en-US"/>
+            </w:rPr>
             <w:fldChar w:fldCharType="begin"/>
           </w:r>
           <w:r>
-            <w:instrText xml:space="preserve">CITATION Mic2624 \l 7177 </w:instrText>
-          </w:r>
-          <w:r>
+            <w:instrText xml:space="preserve"> CITATION Mic6b \l 7177 </w:instrText>
+          </w:r>
+          <w:r>
+            <w:rPr>
+              <w:lang w:val="en-US"/>
+            </w:rPr>
             <w:fldChar w:fldCharType="separate"/>
           </w:r>
           <w:r>
             <w:rPr>
               <w:noProof/>
             </w:rPr>
-            <w:t>(Microsoft Learn, 2026a)</w:t>
-          </w:r>
-          <w:r>
+            <w:t>(Microsoft Learn, 2026b)</w:t>
+          </w:r>
+          <w:r>
+            <w:rPr>
+              <w:lang w:val="en-US"/>
+            </w:rPr>
             <w:fldChar w:fldCharType="end"/>
           </w:r>
         </w:sdtContent>
       </w:sdt>
       <w:r>
-        <w:t xml:space="preserve"> - </w:t>
-      </w:r>
-      <w:r>
         <w:rPr>
-          <w:b/>
-          <w:bCs/>
+          <w:lang w:val="en-US"/>
         </w:rPr>
-        <w:t>Create your first containerized Azure Functions</w:t>
-      </w:r>
-    </w:p>
-    <w:p>
-      <w:pPr>
+        <w:t xml:space="preserve">. I also built and tagged both images with version tag </w:t>
+      </w:r>
+      <w:r>
         <w:rPr>
-          <w:b/>
-          <w:bCs/>
+          <w:i/>
+          <w:iCs/>
+          <w:lang w:val="en-US"/>
         </w:rPr>
-      </w:pPr>
+        <w:t xml:space="preserve">v1.0 </w:t>
+      </w:r>
+      <w:r>
+        <w:rPr>
+          <w:lang w:val="en-US"/>
+        </w:rPr>
+        <w:t>and published them directly to the Docker hub under the account st10482062: “</w:t>
+      </w:r>
+      <w:proofErr w:type="spellStart"/>
+      <w:r>
+        <w:rPr>
+          <w:lang w:val="en-US"/>
+        </w:rPr>
+        <w:t>coffeenchill</w:t>
+      </w:r>
+      <w:proofErr w:type="spellEnd"/>
+      <w:r>
+        <w:rPr>
+          <w:lang w:val="en-US"/>
+        </w:rPr>
+        <w:t>-functions” for the Azure Functions application and “</w:t>
+      </w:r>
+      <w:proofErr w:type="spellStart"/>
+      <w:r>
+        <w:rPr>
+          <w:lang w:val="en-US"/>
+        </w:rPr>
+        <w:t>coffeenchill</w:t>
+      </w:r>
+      <w:proofErr w:type="spellEnd"/>
+      <w:r>
+        <w:rPr>
+          <w:lang w:val="en-US"/>
+        </w:rPr>
+        <w:t>-azurite” as a re-tagged instance of the official azurite image</w:t>
+      </w:r>
       <w:sdt>
         <w:sdtPr>
           <w:rPr>
-            <w:b/>
-            <w:bCs/>
+            <w:lang w:val="en-US"/>
           </w:rPr>
-          <w:id w:val="1029842485"/>
+          <w:id w:val="1678001549"/>
           <w:citation/>
         </w:sdtPr>
         <w:sdtContent>
           <w:r>
             <w:rPr>
-              <w:b/>
-              <w:bCs/>
+              <w:lang w:val="en-US"/>
             </w:rPr>
             <w:fldChar w:fldCharType="begin"/>
           </w:r>
           <w:r>
-            <w:rPr>
-              <w:b/>
-              <w:bCs/>
-            </w:rPr>
-            <w:instrText xml:space="preserve">CITATION Mic6b \l 7177 </w:instrText>
-          </w:r>
-          <w:r>
-            <w:rPr>
-              <w:b/>
-              <w:bCs/>
+            <w:instrText xml:space="preserve"> CITATION Doc26 \l 7177 </w:instrText>
+          </w:r>
+          <w:r>
+            <w:rPr>
+              <w:lang w:val="en-US"/>
             </w:rPr>
             <w:fldChar w:fldCharType="separate"/>
           </w:r>
@@ -3429,12 +3533,17 @@
             <w:rPr>
               <w:noProof/>
             </w:rPr>
-            <w:t>(Microsoft Learn, 2026b)</w:t>
-          </w:r>
-          <w:r>
-            <w:rPr>
-              <w:b/>
-              <w:bCs/>
+            <w:t xml:space="preserve"> </w:t>
+          </w:r>
+          <w:r>
+            <w:rPr>
+              <w:noProof/>
+            </w:rPr>
+            <w:t>(Docker, 2026a)</w:t>
+          </w:r>
+          <w:r>
+            <w:rPr>
+              <w:lang w:val="en-US"/>
             </w:rPr>
             <w:fldChar w:fldCharType="end"/>
           </w:r>
@@ -3442,54 +3551,31 @@
       </w:sdt>
       <w:r>
         <w:rPr>
-          <w:b/>
-          <w:bCs/>
+          <w:lang w:val="en-US"/>
         </w:rPr>
-        <w:t xml:space="preserve"> - </w:t>
-      </w:r>
-      <w:r>
-        <w:rPr>
-          <w:b/>
-          <w:bCs/>
-        </w:rPr>
-        <w:t>Work with containers and Azure Functions</w:t>
-      </w:r>
-    </w:p>
-    <w:p>
-      <w:pPr>
-        <w:rPr>
-          <w:b/>
-          <w:bCs/>
-        </w:rPr>
-      </w:pPr>
+        <w:t xml:space="preserve">, </w:t>
+      </w:r>
       <w:sdt>
         <w:sdtPr>
           <w:rPr>
-            <w:b/>
-            <w:bCs/>
+            <w:lang w:val="en-US"/>
           </w:rPr>
-          <w:id w:val="-1963182511"/>
+          <w:id w:val="-946081997"/>
           <w:citation/>
         </w:sdtPr>
         <w:sdtContent>
           <w:r>
             <w:rPr>
-              <w:b/>
-              <w:bCs/>
+              <w:lang w:val="en-US"/>
             </w:rPr>
             <w:fldChar w:fldCharType="begin"/>
           </w:r>
           <w:r>
-            <w:rPr>
-              <w:b/>
-              <w:bCs/>
-            </w:rPr>
-            <w:instrText xml:space="preserve">CITATION Doc26 \l 7177 </w:instrText>
-          </w:r>
-          <w:r>
-            <w:rPr>
-              <w:b/>
-              <w:bCs/>
+            <w:instrText xml:space="preserve"> CITATION Doc6b \l 7177 </w:instrText>
+          </w:r>
+          <w:r>
+            <w:rPr>
+              <w:lang w:val="en-US"/>
             </w:rPr>
             <w:fldChar w:fldCharType="separate"/>
           </w:r>
@@ -3497,12 +3583,11 @@
             <w:rPr>
               <w:noProof/>
             </w:rPr>
-            <w:t>(Docker, 2026a)</w:t>
-          </w:r>
-          <w:r>
-            <w:rPr>
-              <w:b/>
-              <w:bCs/>
+            <w:t>(Docker, 2026b)</w:t>
+          </w:r>
+          <w:r>
+            <w:rPr>
+              <w:lang w:val="en-US"/>
             </w:rPr>
             <w:fldChar w:fldCharType="end"/>
           </w:r>
@@ -3510,54 +3595,31 @@
       </w:sdt>
       <w:r>
         <w:rPr>
-          <w:b/>
-          <w:bCs/>
+          <w:lang w:val="en-US"/>
         </w:rPr>
-        <w:t xml:space="preserve"> - </w:t>
-      </w:r>
-      <w:r>
-        <w:rPr>
-          <w:b/>
-          <w:bCs/>
-        </w:rPr>
-        <w:t>Build and push your first image</w:t>
-      </w:r>
-    </w:p>
-    <w:p>
-      <w:pPr>
-        <w:rPr>
-          <w:b/>
-          <w:bCs/>
-        </w:rPr>
-      </w:pPr>
+        <w:t>,</w:t>
+      </w:r>
       <w:sdt>
         <w:sdtPr>
           <w:rPr>
-            <w:b/>
-            <w:bCs/>
+            <w:lang w:val="en-US"/>
           </w:rPr>
-          <w:id w:val="1725568058"/>
+          <w:id w:val="-152375420"/>
           <w:citation/>
         </w:sdtPr>
         <w:sdtContent>
           <w:r>
             <w:rPr>
-              <w:b/>
-              <w:bCs/>
+              <w:lang w:val="en-US"/>
             </w:rPr>
             <w:fldChar w:fldCharType="begin"/>
           </w:r>
           <w:r>
-            <w:rPr>
-              <w:b/>
-              <w:bCs/>
-            </w:rPr>
-            <w:instrText xml:space="preserve"> CITATION Doc6b \l 7177 </w:instrText>
-          </w:r>
-          <w:r>
-            <w:rPr>
-              <w:b/>
-              <w:bCs/>
+            <w:instrText xml:space="preserve"> CITATION Doc6c \l 7177 </w:instrText>
+          </w:r>
+          <w:r>
+            <w:rPr>
+              <w:lang w:val="en-US"/>
             </w:rPr>
             <w:fldChar w:fldCharType="separate"/>
           </w:r>
@@ -3565,12 +3627,17 @@
             <w:rPr>
               <w:noProof/>
             </w:rPr>
-            <w:t>(Docker, 2026b)</w:t>
-          </w:r>
-          <w:r>
-            <w:rPr>
-              <w:b/>
-              <w:bCs/>
+            <w:t xml:space="preserve"> </w:t>
+          </w:r>
+          <w:r>
+            <w:rPr>
+              <w:noProof/>
+            </w:rPr>
+            <w:t>(Docker, 2026c)</w:t>
+          </w:r>
+          <w:r>
+            <w:rPr>
+              <w:lang w:val="en-US"/>
             </w:rPr>
             <w:fldChar w:fldCharType="end"/>
           </w:r>
@@ -3578,54 +3645,31 @@
       </w:sdt>
       <w:r>
         <w:rPr>
-          <w:b/>
-          <w:bCs/>
+          <w:lang w:val="en-US"/>
         </w:rPr>
-        <w:t xml:space="preserve"> - </w:t>
-      </w:r>
-      <w:r>
-        <w:rPr>
-          <w:b/>
-          <w:bCs/>
-        </w:rPr>
-        <w:t>Docker Hub quickstart</w:t>
-      </w:r>
-    </w:p>
-    <w:p>
-      <w:pPr>
-        <w:rPr>
-          <w:b/>
-          <w:bCs/>
-        </w:rPr>
-      </w:pPr>
+        <w:t>,</w:t>
+      </w:r>
       <w:sdt>
         <w:sdtPr>
           <w:rPr>
-            <w:b/>
-            <w:bCs/>
+            <w:lang w:val="en-US"/>
           </w:rPr>
-          <w:id w:val="-824350814"/>
+          <w:id w:val="-1747265548"/>
           <w:citation/>
         </w:sdtPr>
         <w:sdtContent>
           <w:r>
             <w:rPr>
-              <w:b/>
-              <w:bCs/>
+              <w:lang w:val="en-US"/>
             </w:rPr>
             <w:fldChar w:fldCharType="begin"/>
           </w:r>
           <w:r>
-            <w:rPr>
-              <w:b/>
-              <w:bCs/>
-            </w:rPr>
-            <w:instrText xml:space="preserve"> CITATION Doc6c \l 7177 </w:instrText>
-          </w:r>
-          <w:r>
-            <w:rPr>
-              <w:b/>
-              <w:bCs/>
+            <w:instrText xml:space="preserve"> CITATION Doc6d \l 7177 </w:instrText>
+          </w:r>
+          <w:r>
+            <w:rPr>
+              <w:lang w:val="en-US"/>
             </w:rPr>
             <w:fldChar w:fldCharType="separate"/>
           </w:r>
@@ -3633,12 +3677,17 @@
             <w:rPr>
               <w:noProof/>
             </w:rPr>
-            <w:t>(Docker, 2026c)</w:t>
-          </w:r>
-          <w:r>
-            <w:rPr>
-              <w:b/>
-              <w:bCs/>
+            <w:t xml:space="preserve"> </w:t>
+          </w:r>
+          <w:r>
+            <w:rPr>
+              <w:noProof/>
+            </w:rPr>
+            <w:t>(Docker, 2026d)</w:t>
+          </w:r>
+          <w:r>
+            <w:rPr>
+              <w:lang w:val="en-US"/>
             </w:rPr>
             <w:fldChar w:fldCharType="end"/>
           </w:r>
@@ -3646,54 +3695,59 @@
       </w:sdt>
       <w:r>
         <w:rPr>
-          <w:b/>
-          <w:bCs/>
+          <w:lang w:val="en-US"/>
         </w:rPr>
-        <w:t xml:space="preserve"> - </w:t>
-      </w:r>
+        <w:t>. Azurite also runs in its own standalone Docker container with the “—</w:t>
+      </w:r>
+      <w:proofErr w:type="spellStart"/>
       <w:r>
         <w:rPr>
-          <w:b/>
-          <w:bCs/>
+          <w:lang w:val="en-US"/>
         </w:rPr>
-        <w:t>Push images to a repository</w:t>
-      </w:r>
-    </w:p>
-    <w:p>
-      <w:pPr>
+        <w:t>skipApiVersionCheck</w:t>
+      </w:r>
+      <w:proofErr w:type="spellEnd"/>
+      <w:r>
         <w:rPr>
-          <w:b/>
-          <w:bCs/>
+          <w:lang w:val="en-US"/>
         </w:rPr>
-      </w:pPr>
+        <w:t>” flag bound to ports 10000, 10001, and 10002, and both contains communicate with each other over a shared docker network called “</w:t>
+      </w:r>
+      <w:proofErr w:type="spellStart"/>
+      <w:r>
+        <w:rPr>
+          <w:lang w:val="en-US"/>
+        </w:rPr>
+        <w:t>coffeenchil</w:t>
+      </w:r>
+      <w:proofErr w:type="spellEnd"/>
+      <w:r>
+        <w:rPr>
+          <w:lang w:val="en-US"/>
+        </w:rPr>
+        <w:t xml:space="preserve">-net” </w:t>
+      </w:r>
       <w:sdt>
         <w:sdtPr>
           <w:rPr>
-            <w:b/>
-            <w:bCs/>
+            <w:lang w:val="en-US"/>
           </w:rPr>
-          <w:id w:val="-1797363974"/>
+          <w:id w:val="-2016832736"/>
           <w:citation/>
         </w:sdtPr>
         <w:sdtContent>
           <w:r>
             <w:rPr>
-              <w:b/>
-              <w:bCs/>
+              <w:lang w:val="en-US"/>
             </w:rPr>
             <w:fldChar w:fldCharType="begin"/>
           </w:r>
           <w:r>
-            <w:rPr>
-              <w:b/>
-              <w:bCs/>
-            </w:rPr>
-            <w:instrText xml:space="preserve"> CITATION Doc6d \l 7177 </w:instrText>
-          </w:r>
-          <w:r>
-            <w:rPr>
-              <w:b/>
-              <w:bCs/>
+            <w:instrText xml:space="preserve"> CITATION Mic5a \l 7177 </w:instrText>
+          </w:r>
+          <w:r>
+            <w:rPr>
+              <w:lang w:val="en-US"/>
             </w:rPr>
             <w:fldChar w:fldCharType="separate"/>
           </w:r>
@@ -3701,12 +3755,11 @@
             <w:rPr>
               <w:noProof/>
             </w:rPr>
-            <w:t>(Docker, 2026d)</w:t>
-          </w:r>
-          <w:r>
-            <w:rPr>
-              <w:b/>
-              <w:bCs/>
+            <w:t>(Microsoft Learn, 2025a)</w:t>
+          </w:r>
+          <w:r>
+            <w:rPr>
+              <w:lang w:val="en-US"/>
             </w:rPr>
             <w:fldChar w:fldCharType="end"/>
           </w:r>
@@ -3714,19 +3767,58 @@
       </w:sdt>
       <w:r>
         <w:rPr>
-          <w:b/>
-          <w:bCs/>
+          <w:lang w:val="en-US"/>
         </w:rPr>
-        <w:t xml:space="preserve"> - </w:t>
-      </w:r>
+        <w:t xml:space="preserve">, </w:t>
+      </w:r>
+      <w:sdt>
+        <w:sdtPr>
+          <w:rPr>
+            <w:lang w:val="en-US"/>
+          </w:rPr>
+          <w:id w:val="502334996"/>
+          <w:citation/>
+        </w:sdtPr>
+        <w:sdtContent>
+          <w:r>
+            <w:rPr>
+              <w:lang w:val="en-US"/>
+            </w:rPr>
+            <w:fldChar w:fldCharType="begin"/>
+          </w:r>
+          <w:r>
+            <w:instrText xml:space="preserve"> CITATION Mic6b \l 7177 </w:instrText>
+          </w:r>
+          <w:r>
+            <w:rPr>
+              <w:lang w:val="en-US"/>
+            </w:rPr>
+            <w:fldChar w:fldCharType="separate"/>
+          </w:r>
+          <w:r>
+            <w:rPr>
+              <w:noProof/>
+            </w:rPr>
+            <w:t>(Microsoft Learn, 2026b)</w:t>
+          </w:r>
+          <w:r>
+            <w:rPr>
+              <w:lang w:val="en-US"/>
+            </w:rPr>
+            <w:fldChar w:fldCharType="end"/>
+          </w:r>
+        </w:sdtContent>
+      </w:sdt>
       <w:r>
         <w:rPr>
-          <w:b/>
-          <w:bCs/>
+          <w:lang w:val="en-US"/>
         </w:rPr>
-        <w:t>Build, tag, and publish an image</w:t>
+        <w:t xml:space="preserve">. </w:t>
       </w:r>
     </w:p>
+    <w:p/>
+    <w:p/>
+    <w:p/>
     <w:p>
       <w:pPr>
         <w:rPr>
@@ -3790,13 +3882,24 @@
         <w:t> </w:t>
       </w:r>
       <w:bookmarkStart w:id="7" w:name="_Toc239423707"/>
+      <w:proofErr w:type="spellStart"/>
       <w:r>
         <w:rPr>
           <w:b/>
           <w:bCs/>
         </w:rPr>
-        <w:t>local.settings.json</w:t>
-      </w:r>
+        <w:t>local.</w:t>
+      </w:r>
+      <w:proofErr w:type="gramStart"/>
+      <w:r>
+        <w:rPr>
+          <w:b/>
+          <w:bCs/>
+        </w:rPr>
+        <w:t>settings.json</w:t>
+      </w:r>
+      <w:proofErr w:type="spellEnd"/>
+      <w:proofErr w:type="gramEnd"/>
       <w:r>
         <w:rPr>
           <w:b/>
@@ -3887,6 +3990,55 @@
       </w:r>
       <w:bookmarkEnd w:id="8"/>
     </w:p>
+    <w:p>
+      <w:r>
+        <w:rPr>
+          <w:noProof/>
+        </w:rPr>
+        <w:drawing>
+          <wp:inline distT="0" distB="0" distL="0" distR="0" wp14:anchorId="3055316B" wp14:editId="36FAEA61">
+            <wp:extent cx="5731510" cy="3220720"/>
+            <wp:effectExtent l="0" t="0" r="2540" b="0"/>
+            <wp:docPr id="1913875839" name="Picture 11"/>
+            <wp:cNvGraphicFramePr>
+              <a:graphicFrameLocks xmlns:a="http://schemas.openxmlformats.org/drawingml/2006/main" noChangeAspect="1"/>
+            </wp:cNvGraphicFramePr>
+            <a:graphic xmlns:a="http://schemas.openxmlformats.org/drawingml/2006/main">
+              <a:graphicData uri="http://schemas.openxmlformats.org/drawingml/2006/picture">
+                <pic:pic xmlns:pic="http://schemas.openxmlformats.org/drawingml/2006/picture">
+                  <pic:nvPicPr>
+                    <pic:cNvPr id="1913875839" name="Picture 1913875839"/>
+                    <pic:cNvPicPr/>
+                  </pic:nvPicPr>
+                  <pic:blipFill>
+                    <a:blip r:embed="rId9">
+                      <a:extLst>
+                        <a:ext uri="{28A0092B-C50C-407E-A947-70E740481C1C}">
+                          <a14:useLocalDpi xmlns:a14="http://schemas.microsoft.com/office/drawing/2010/main" val="0"/>
+                        </a:ext>
+                      </a:extLst>
+                    </a:blip>
+                    <a:stretch>
+                      <a:fillRect/>
+                    </a:stretch>
+                  </pic:blipFill>
+                  <pic:spPr>
+                    <a:xfrm>
+                      <a:off x="0" y="0"/>
+                      <a:ext cx="5731510" cy="3220720"/>
+                    </a:xfrm>
+                    <a:prstGeom prst="rect">
+                      <a:avLst/>
+                    </a:prstGeom>
+                  </pic:spPr>
+                </pic:pic>
+              </a:graphicData>
+            </a:graphic>
+          </wp:inline>
+        </w:drawing>
+      </w:r>
+    </w:p>
+    <w:p/>
     <w:p/>
     <w:p>
       <w:pPr>
@@ -3902,6 +4054,7 @@
           <w:b/>
           <w:bCs/>
         </w:rPr>
+        <w:lastRenderedPageBreak/>
         <w:t>Docker Hub Public Images</w:t>
       </w:r>
       <w:r>
@@ -3920,7 +4073,54 @@
       </w:r>
       <w:bookmarkEnd w:id="9"/>
     </w:p>
-    <w:p/>
+    <w:p>
+      <w:r>
+        <w:rPr>
+          <w:noProof/>
+        </w:rPr>
+        <w:drawing>
+          <wp:inline distT="0" distB="0" distL="0" distR="0" wp14:anchorId="3B089D16" wp14:editId="5677EC86">
+            <wp:extent cx="5731510" cy="2544445"/>
+            <wp:effectExtent l="0" t="0" r="2540" b="8255"/>
+            <wp:docPr id="1346377777" name="Picture 12"/>
+            <wp:cNvGraphicFramePr>
+              <a:graphicFrameLocks xmlns:a="http://schemas.openxmlformats.org/drawingml/2006/main" noChangeAspect="1"/>
+            </wp:cNvGraphicFramePr>
+            <a:graphic xmlns:a="http://schemas.openxmlformats.org/drawingml/2006/main">
+              <a:graphicData uri="http://schemas.openxmlformats.org/drawingml/2006/picture">
+                <pic:pic xmlns:pic="http://schemas.openxmlformats.org/drawingml/2006/picture">
+                  <pic:nvPicPr>
+                    <pic:cNvPr id="1346377777" name="Picture 1346377777"/>
+                    <pic:cNvPicPr/>
+                  </pic:nvPicPr>
+                  <pic:blipFill>
+                    <a:blip r:embed="rId10">
+                      <a:extLst>
+                        <a:ext uri="{28A0092B-C50C-407E-A947-70E740481C1C}">
+                          <a14:useLocalDpi xmlns:a14="http://schemas.microsoft.com/office/drawing/2010/main" val="0"/>
+                        </a:ext>
+                      </a:extLst>
+                    </a:blip>
+                    <a:stretch>
+                      <a:fillRect/>
+                    </a:stretch>
+                  </pic:blipFill>
+                  <pic:spPr>
+                    <a:xfrm>
+                      <a:off x="0" y="0"/>
+                      <a:ext cx="5731510" cy="2544445"/>
+                    </a:xfrm>
+                    <a:prstGeom prst="rect">
+                      <a:avLst/>
+                    </a:prstGeom>
+                  </pic:spPr>
+                </pic:pic>
+              </a:graphicData>
+            </a:graphic>
+          </wp:inline>
+        </w:drawing>
+      </w:r>
+    </w:p>
     <w:p>
       <w:pPr>
         <w:pStyle w:val="Heading2"/>
@@ -3945,10 +4145,46 @@
       </w:r>
       <w:bookmarkEnd w:id="10"/>
     </w:p>
-    <w:p/>
     <w:p>
       <w:r>
-        <w:t>Can put this last</w:t>
+        <w:rPr>
+          <w:noProof/>
+        </w:rPr>
+        <w:drawing>
+          <wp:inline distT="0" distB="0" distL="0" distR="0" wp14:anchorId="75C49C07" wp14:editId="26DCE6C4">
+            <wp:extent cx="5731510" cy="3220720"/>
+            <wp:effectExtent l="0" t="0" r="2540" b="0"/>
+            <wp:docPr id="986234031" name="Picture 1"/>
+            <wp:cNvGraphicFramePr>
+              <a:graphicFrameLocks xmlns:a="http://schemas.openxmlformats.org/drawingml/2006/main" noChangeAspect="1"/>
+            </wp:cNvGraphicFramePr>
+            <a:graphic xmlns:a="http://schemas.openxmlformats.org/drawingml/2006/main">
+              <a:graphicData uri="http://schemas.openxmlformats.org/drawingml/2006/picture">
+                <pic:pic xmlns:pic="http://schemas.openxmlformats.org/drawingml/2006/picture">
+                  <pic:nvPicPr>
+                    <pic:cNvPr id="986234031" name=""/>
+                    <pic:cNvPicPr/>
+                  </pic:nvPicPr>
+                  <pic:blipFill>
+                    <a:blip r:embed="rId11"/>
+                    <a:stretch>
+                      <a:fillRect/>
+                    </a:stretch>
+                  </pic:blipFill>
+                  <pic:spPr>
+                    <a:xfrm>
+                      <a:off x="0" y="0"/>
+                      <a:ext cx="5731510" cy="3220720"/>
+                    </a:xfrm>
+                    <a:prstGeom prst="rect">
+                      <a:avLst/>
+                    </a:prstGeom>
+                  </pic:spPr>
+                </pic:pic>
+              </a:graphicData>
+            </a:graphic>
+          </wp:inline>
+        </w:drawing>
       </w:r>
     </w:p>
     <w:p>
@@ -3957,6 +4193,75 @@
           <w:noProof/>
         </w:rPr>
         <w:lastRenderedPageBreak/>
+        <w:drawing>
+          <wp:inline distT="0" distB="0" distL="0" distR="0" wp14:anchorId="5D3A51DD" wp14:editId="56F6FFD6">
+            <wp:extent cx="5731510" cy="3208020"/>
+            <wp:effectExtent l="0" t="0" r="2540" b="0"/>
+            <wp:docPr id="1354273447" name="Picture 1"/>
+            <wp:cNvGraphicFramePr>
+              <a:graphicFrameLocks xmlns:a="http://schemas.openxmlformats.org/drawingml/2006/main" noChangeAspect="1"/>
+            </wp:cNvGraphicFramePr>
+            <a:graphic xmlns:a="http://schemas.openxmlformats.org/drawingml/2006/main">
+              <a:graphicData uri="http://schemas.openxmlformats.org/drawingml/2006/picture">
+                <pic:pic xmlns:pic="http://schemas.openxmlformats.org/drawingml/2006/picture">
+                  <pic:nvPicPr>
+                    <pic:cNvPr id="1354273447" name=""/>
+                    <pic:cNvPicPr/>
+                  </pic:nvPicPr>
+                  <pic:blipFill>
+                    <a:blip r:embed="rId12"/>
+                    <a:stretch>
+                      <a:fillRect/>
+                    </a:stretch>
+                  </pic:blipFill>
+                  <pic:spPr>
+                    <a:xfrm>
+                      <a:off x="0" y="0"/>
+                      <a:ext cx="5731510" cy="3208020"/>
+                    </a:xfrm>
+                    <a:prstGeom prst="rect">
+                      <a:avLst/>
+                    </a:prstGeom>
+                  </pic:spPr>
+                </pic:pic>
+              </a:graphicData>
+            </a:graphic>
+          </wp:inline>
+        </w:drawing>
+      </w:r>
+    </w:p>
+    <w:p>
+      <w:r>
+        <w:t xml:space="preserve">Upload staff documents </w:t>
+      </w:r>
+      <w:proofErr w:type="gramStart"/>
+      <w:r>
+        <w:t>fails</w:t>
+      </w:r>
+      <w:proofErr w:type="gramEnd"/>
+      <w:r>
+        <w:t xml:space="preserve"> when it is run together with </w:t>
+      </w:r>
+      <w:proofErr w:type="gramStart"/>
+      <w:r>
+        <w:t>everything, but</w:t>
+      </w:r>
+      <w:proofErr w:type="gramEnd"/>
+      <w:r>
+        <w:t xml:space="preserve"> works when it is tested individually. </w:t>
+      </w:r>
+    </w:p>
+    <w:p>
+      <w:r>
+        <w:t>See below:</w:t>
+      </w:r>
+    </w:p>
+    <w:p/>
+    <w:p>
+      <w:r>
+        <w:rPr>
+          <w:noProof/>
+        </w:rPr>
         <w:drawing>
           <wp:inline distT="0" distB="0" distL="0" distR="0" wp14:anchorId="0DE5D885" wp14:editId="6169D15B">
             <wp:extent cx="5731510" cy="3223895"/>
@@ -3973,7 +4278,7 @@
                     <pic:cNvPicPr/>
                   </pic:nvPicPr>
                   <pic:blipFill>
-                    <a:blip r:embed="rId9">
+                    <a:blip r:embed="rId13">
                       <a:extLst>
                         <a:ext uri="{28A0092B-C50C-407E-A947-70E740481C1C}">
                           <a14:useLocalDpi xmlns:a14="http://schemas.microsoft.com/office/drawing/2010/main" val="0"/>
@@ -4015,6 +4320,7 @@
           <w:b/>
           <w:bCs/>
         </w:rPr>
+        <w:lastRenderedPageBreak/>
         <w:t>GitHub Commit History / Contributors</w:t>
       </w:r>
       <w:r>
@@ -4047,7 +4353,7 @@
                     <pic:cNvPicPr/>
                   </pic:nvPicPr>
                   <pic:blipFill>
-                    <a:blip r:embed="rId10">
+                    <a:blip r:embed="rId14">
                       <a:extLst>
                         <a:ext uri="{28A0092B-C50C-407E-A947-70E740481C1C}">
                           <a14:useLocalDpi xmlns:a14="http://schemas.microsoft.com/office/drawing/2010/main" val="0"/>
@@ -4079,7 +4385,6 @@
         <w:rPr>
           <w:noProof/>
         </w:rPr>
-        <w:lastRenderedPageBreak/>
         <w:drawing>
           <wp:inline distT="0" distB="0" distL="0" distR="0" wp14:anchorId="0220C2E4" wp14:editId="0465B847">
             <wp:extent cx="5731510" cy="2880995"/>
@@ -4096,7 +4401,7 @@
                     <pic:cNvPicPr/>
                   </pic:nvPicPr>
                   <pic:blipFill>
-                    <a:blip r:embed="rId11">
+                    <a:blip r:embed="rId15">
                       <a:extLst>
                         <a:ext uri="{28A0092B-C50C-407E-A947-70E740481C1C}">
                           <a14:useLocalDpi xmlns:a14="http://schemas.microsoft.com/office/drawing/2010/main" val="0"/>
@@ -4138,6 +4443,7 @@
           <w:b/>
           <w:bCs/>
         </w:rPr>
+        <w:lastRenderedPageBreak/>
         <w:t>GitHub Pull Requests Merged</w:t>
       </w:r>
       <w:r>
@@ -4170,7 +4476,7 @@
                     <pic:cNvPicPr/>
                   </pic:nvPicPr>
                   <pic:blipFill>
-                    <a:blip r:embed="rId12">
+                    <a:blip r:embed="rId16">
                       <a:extLst>
                         <a:ext uri="{28A0092B-C50C-407E-A947-70E740481C1C}">
                           <a14:useLocalDpi xmlns:a14="http://schemas.microsoft.com/office/drawing/2010/main" val="0"/>
@@ -4218,7 +4524,7 @@
                     <pic:cNvPicPr/>
                   </pic:nvPicPr>
                   <pic:blipFill>
-                    <a:blip r:embed="rId13">
+                    <a:blip r:embed="rId17">
                       <a:extLst>
                         <a:ext uri="{28A0092B-C50C-407E-A947-70E740481C1C}">
                           <a14:useLocalDpi xmlns:a14="http://schemas.microsoft.com/office/drawing/2010/main" val="0"/>
@@ -4260,7 +4566,6 @@
           <w:b/>
           <w:bCs/>
         </w:rPr>
-        <w:lastRenderedPageBreak/>
         <w:t>Staff Documents Testing Evidence</w:t>
       </w:r>
       <w:r>
@@ -4288,20 +4593,19 @@
     <w:bookmarkStart w:id="14" w:name="_Toc239423714" w:displacedByCustomXml="next"/>
     <w:sdt>
       <w:sdtPr>
+        <w:rPr>
+          <w:rFonts w:asciiTheme="minorHAnsi" w:eastAsiaTheme="minorHAnsi" w:hAnsiTheme="minorHAnsi" w:cstheme="minorBidi"/>
+          <w:color w:val="auto"/>
+          <w:sz w:val="22"/>
+          <w:szCs w:val="22"/>
+        </w:rPr>
         <w:id w:val="-1760592740"/>
         <w:docPartObj>
           <w:docPartGallery w:val="Bibliographies"/>
           <w:docPartUnique/>
         </w:docPartObj>
       </w:sdtPr>
-      <w:sdtEndPr>
-        <w:rPr>
-          <w:rFonts w:asciiTheme="minorHAnsi" w:eastAsiaTheme="minorHAnsi" w:hAnsiTheme="minorHAnsi" w:cstheme="minorBidi"/>
-          <w:color w:val="auto"/>
-          <w:sz w:val="22"/>
-          <w:szCs w:val="22"/>
-        </w:rPr>
-      </w:sdtEndPr>
+      <w:sdtEndPr/>
       <w:sdtContent>
         <w:p>
           <w:pPr>
@@ -4350,7 +4654,7 @@
             <w:br/>
             <w:t xml:space="preserve">Available at: </w:t>
           </w:r>
-          <w:hyperlink r:id="rId14" w:history="1">
+          <w:hyperlink r:id="rId18" w:history="1">
             <w:r>
               <w:rPr>
                 <w:rStyle w:val="Hyperlink"/>
@@ -4401,7 +4705,7 @@
             <w:br/>
             <w:t xml:space="preserve">Available at: </w:t>
           </w:r>
-          <w:hyperlink r:id="rId15" w:history="1">
+          <w:hyperlink r:id="rId19" w:history="1">
             <w:r>
               <w:rPr>
                 <w:rStyle w:val="Hyperlink"/>
@@ -4452,7 +4756,7 @@
             <w:br/>
             <w:t xml:space="preserve">Available at: </w:t>
           </w:r>
-          <w:hyperlink r:id="rId16" w:history="1">
+          <w:hyperlink r:id="rId20" w:history="1">
             <w:r>
               <w:rPr>
                 <w:rStyle w:val="Hyperlink"/>
@@ -4503,7 +4807,7 @@
             <w:br/>
             <w:t xml:space="preserve">Available at: </w:t>
           </w:r>
-          <w:hyperlink r:id="rId17" w:history="1">
+          <w:hyperlink r:id="rId21" w:history="1">
             <w:r>
               <w:rPr>
                 <w:rStyle w:val="Hyperlink"/>
@@ -4554,7 +4858,7 @@
             <w:br/>
             <w:t xml:space="preserve">Available at: </w:t>
           </w:r>
-          <w:hyperlink r:id="rId18" w:history="1">
+          <w:hyperlink r:id="rId22" w:history="1">
             <w:r>
               <w:rPr>
                 <w:rStyle w:val="Hyperlink"/>
@@ -4605,7 +4909,7 @@
             <w:br/>
             <w:t xml:space="preserve">Available at: </w:t>
           </w:r>
-          <w:hyperlink r:id="rId19" w:history="1">
+          <w:hyperlink r:id="rId23" w:history="1">
             <w:r>
               <w:rPr>
                 <w:rStyle w:val="Hyperlink"/>
@@ -4656,7 +4960,7 @@
             <w:br/>
             <w:t xml:space="preserve">Available at: </w:t>
           </w:r>
-          <w:hyperlink r:id="rId20" w:history="1">
+          <w:hyperlink r:id="rId24" w:history="1">
             <w:r>
               <w:rPr>
                 <w:rStyle w:val="Hyperlink"/>
@@ -4707,7 +5011,7 @@
             <w:br/>
             <w:t xml:space="preserve">Available at: </w:t>
           </w:r>
-          <w:hyperlink r:id="rId21" w:history="1">
+          <w:hyperlink r:id="rId25" w:history="1">
             <w:r>
               <w:rPr>
                 <w:rStyle w:val="Hyperlink"/>
@@ -4758,7 +5062,7 @@
             <w:br/>
             <w:t xml:space="preserve">Available at: </w:t>
           </w:r>
-          <w:hyperlink r:id="rId22" w:history="1">
+          <w:hyperlink r:id="rId26" w:history="1">
             <w:r>
               <w:rPr>
                 <w:rStyle w:val="Hyperlink"/>
@@ -4809,7 +5113,7 @@
             <w:br/>
             <w:t xml:space="preserve">Available at: </w:t>
           </w:r>
-          <w:hyperlink r:id="rId23" w:history="1">
+          <w:hyperlink r:id="rId27" w:history="1">
             <w:r>
               <w:rPr>
                 <w:rStyle w:val="Hyperlink"/>
@@ -4860,7 +5164,7 @@
             <w:br/>
             <w:t xml:space="preserve">Available at: </w:t>
           </w:r>
-          <w:hyperlink r:id="rId24" w:history="1">
+          <w:hyperlink r:id="rId28" w:history="1">
             <w:r>
               <w:rPr>
                 <w:rStyle w:val="Hyperlink"/>
@@ -4912,7 +5216,7 @@
             <w:br/>
             <w:t xml:space="preserve">Available at: </w:t>
           </w:r>
-          <w:hyperlink r:id="rId25" w:history="1">
+          <w:hyperlink r:id="rId29" w:history="1">
             <w:r>
               <w:rPr>
                 <w:rStyle w:val="Hyperlink"/>
@@ -4963,7 +5267,7 @@
             <w:br/>
             <w:t xml:space="preserve">Available at: </w:t>
           </w:r>
-          <w:hyperlink r:id="rId26" w:history="1">
+          <w:hyperlink r:id="rId30" w:history="1">
             <w:r>
               <w:rPr>
                 <w:rStyle w:val="Hyperlink"/>
@@ -4985,7 +5289,7 @@
     </w:sdt>
     <w:p/>
     <w:sectPr>
-      <w:footerReference w:type="default" r:id="rId27"/>
+      <w:footerReference w:type="default" r:id="rId31"/>
       <w:pgSz w:w="11906" w:h="16838"/>
       <w:pgMar w:top="1440" w:right="1440" w:bottom="1440" w:left="1440" w:header="708" w:footer="708" w:gutter="0"/>
       <w:pgNumType w:start="0"/>
@@ -5962,6 +6266,7 @@
   <w:style w:type="character" w:default="1" w:styleId="DefaultParagraphFont">
     <w:name w:val="Default Paragraph Font"/>
     <w:uiPriority w:val="1"/>
+    <w:semiHidden/>
     <w:unhideWhenUsed/>
   </w:style>
   <w:style w:type="table" w:default="1" w:styleId="TableNormal">
@@ -6751,7 +7056,7 @@
     <b:MonthAccessed>September</b:MonthAccessed>
     <b:DayAccessed>04</b:DayAccessed>
     <b:URL>https://docs.docker.com/get-started/introduction/build-and-push-first-image/</b:URL>
-    <b:RefOrder>10</b:RefOrder>
+    <b:RefOrder>9</b:RefOrder>
   </b:Source>
   <b:Source>
     <b:Tag>Doc6b</b:Tag>
@@ -6768,7 +7073,7 @@
     <b:MonthAccessed>September</b:MonthAccessed>
     <b:DayAccessed>04</b:DayAccessed>
     <b:URL>https://docs.docker.com/docker-hub/quickstart/</b:URL>
-    <b:RefOrder>11</b:RefOrder>
+    <b:RefOrder>10</b:RefOrder>
   </b:Source>
   <b:Source>
     <b:Tag>Doc6c</b:Tag>
@@ -6785,7 +7090,7 @@
     <b:MonthAccessed>September</b:MonthAccessed>
     <b:DayAccessed>04</b:DayAccessed>
     <b:URL>https://docs.docker.com/docker-hub/repos/manage/hub-images/push/</b:URL>
-    <b:RefOrder>12</b:RefOrder>
+    <b:RefOrder>11</b:RefOrder>
   </b:Source>
   <b:Source>
     <b:Tag>Doc6d</b:Tag>
@@ -6802,7 +7107,7 @@
     <b:MonthAccessed>September</b:MonthAccessed>
     <b:DayAccessed>04</b:DayAccessed>
     <b:URL>https://docs.docker.com/get-started/docker-concepts/building-images/build-tag-and-publish-an-image/</b:URL>
-    <b:RefOrder>13</b:RefOrder>
+    <b:RefOrder>12</b:RefOrder>
   </b:Source>
   <b:Source>
     <b:Tag>Mic5a1</b:Tag>
@@ -6853,7 +7158,7 @@
     <b:MonthAccessed>September</b:MonthAccessed>
     <b:DayAccessed>04</b:DayAccessed>
     <b:URL>https://learn.microsoft.com/en-us/azure/azure-functions/functions-deploy-container</b:URL>
-    <b:RefOrder>8</b:RefOrder>
+    <b:RefOrder>7</b:RefOrder>
   </b:Source>
   <b:Source>
     <b:Tag>Mic5a</b:Tag>
@@ -6870,7 +7175,7 @@
     <b:MonthAccessed>September</b:MonthAccessed>
     <b:DayAccessed>04</b:DayAccessed>
     <b:URL>https://learn.microsoft.com/en-us/azure/storage/common/storage-install-azurite</b:URL>
-    <b:RefOrder>7</b:RefOrder>
+    <b:RefOrder>13</b:RefOrder>
   </b:Source>
   <b:Source>
     <b:Tag>Mic6b</b:Tag>
@@ -6887,7 +7192,7 @@
     <b:MonthAccessed>September</b:MonthAccessed>
     <b:DayAccessed>04</b:DayAccessed>
     <b:URL>https://learn.microsoft.com/en-us/azure/azure-functions/functions-how-to-custom-container</b:URL>
-    <b:RefOrder>9</b:RefOrder>
+    <b:RefOrder>8</b:RefOrder>
   </b:Source>
   <b:Source>
     <b:Tag>Mic22</b:Tag>
@@ -6961,7 +7266,7 @@
 </file>
 
 <file path=customXml/itemProps1.xml><?xml version="1.0" encoding="utf-8"?>
-<ds:datastoreItem xmlns:ds="http://schemas.openxmlformats.org/officeDocument/2006/customXml" ds:itemID="{DDBB4E69-82BA-41D8-8FAF-B8FE49DB1055}">
+<ds:datastoreItem xmlns:ds="http://schemas.openxmlformats.org/officeDocument/2006/customXml" ds:itemID="{DFA0D06A-7158-464E-A111-92FE5A8F288B}">
   <ds:schemaRefs>
     <ds:schemaRef ds:uri="http://schemas.openxmlformats.org/officeDocument/2006/bibliography"/>
   </ds:schemaRefs>

</xml_diff>

<commit_message>
docs: updated Part 1 word document
</commit_message>
<xml_diff>
--- a/docs/Word Document/CLDV6212_Part_1.docx
+++ b/docs/Word Document/CLDV6212_Part_1.docx
@@ -1286,7 +1286,7 @@
           <w:r>
             <w:fldChar w:fldCharType="separate"/>
           </w:r>
-          <w:hyperlink w:anchor="_Toc239423700" w:history="1">
+          <w:hyperlink w:anchor="_Toc239427696" w:history="1">
             <w:r>
               <w:rPr>
                 <w:rStyle w:val="Hyperlink"/>
@@ -1313,7 +1313,7 @@
                 <w:noProof/>
                 <w:webHidden/>
               </w:rPr>
-              <w:instrText xml:space="preserve"> PAGEREF _Toc239423700 \h </w:instrText>
+              <w:instrText xml:space="preserve"> PAGEREF _Toc239427696 \h </w:instrText>
             </w:r>
             <w:r>
               <w:rPr>
@@ -1358,7 +1358,7 @@
               <w:lang w:eastAsia="en-ZA"/>
             </w:rPr>
           </w:pPr>
-          <w:hyperlink w:anchor="_Toc239423701" w:history="1">
+          <w:hyperlink w:anchor="_Toc239427697" w:history="1">
             <w:r>
               <w:rPr>
                 <w:rStyle w:val="Hyperlink"/>
@@ -1385,7 +1385,7 @@
                 <w:noProof/>
                 <w:webHidden/>
               </w:rPr>
-              <w:instrText xml:space="preserve"> PAGEREF _Toc239423701 \h </w:instrText>
+              <w:instrText xml:space="preserve"> PAGEREF _Toc239427697 \h </w:instrText>
             </w:r>
             <w:r>
               <w:rPr>
@@ -1430,7 +1430,7 @@
               <w:lang w:eastAsia="en-ZA"/>
             </w:rPr>
           </w:pPr>
-          <w:hyperlink w:anchor="_Toc239423702" w:history="1">
+          <w:hyperlink w:anchor="_Toc239427698" w:history="1">
             <w:r>
               <w:rPr>
                 <w:rStyle w:val="Hyperlink"/>
@@ -1457,7 +1457,7 @@
                 <w:noProof/>
                 <w:webHidden/>
               </w:rPr>
-              <w:instrText xml:space="preserve"> PAGEREF _Toc239423702 \h </w:instrText>
+              <w:instrText xml:space="preserve"> PAGEREF _Toc239427698 \h </w:instrText>
             </w:r>
             <w:r>
               <w:rPr>
@@ -1502,7 +1502,7 @@
               <w:lang w:eastAsia="en-ZA"/>
             </w:rPr>
           </w:pPr>
-          <w:hyperlink w:anchor="_Toc239423703" w:history="1">
+          <w:hyperlink w:anchor="_Toc239427699" w:history="1">
             <w:r>
               <w:rPr>
                 <w:rStyle w:val="Hyperlink"/>
@@ -1531,7 +1531,7 @@
                 <w:noProof/>
                 <w:webHidden/>
               </w:rPr>
-              <w:instrText xml:space="preserve"> PAGEREF _Toc239423703 \h </w:instrText>
+              <w:instrText xml:space="preserve"> PAGEREF _Toc239427699 \h </w:instrText>
             </w:r>
             <w:r>
               <w:rPr>
@@ -1576,7 +1576,7 @@
               <w:lang w:eastAsia="en-ZA"/>
             </w:rPr>
           </w:pPr>
-          <w:hyperlink w:anchor="_Toc239423704" w:history="1">
+          <w:hyperlink w:anchor="_Toc239427700" w:history="1">
             <w:r>
               <w:rPr>
                 <w:rStyle w:val="Hyperlink"/>
@@ -1603,7 +1603,7 @@
                 <w:noProof/>
                 <w:webHidden/>
               </w:rPr>
-              <w:instrText xml:space="preserve"> PAGEREF _Toc239423704 \h </w:instrText>
+              <w:instrText xml:space="preserve"> PAGEREF _Toc239427700 \h </w:instrText>
             </w:r>
             <w:r>
               <w:rPr>
@@ -1648,15 +1648,13 @@
               <w:lang w:eastAsia="en-ZA"/>
             </w:rPr>
           </w:pPr>
-          <w:hyperlink w:anchor="_Toc239423705" w:history="1">
+          <w:hyperlink w:anchor="_Toc239427701" w:history="1">
             <w:r>
               <w:rPr>
                 <w:rStyle w:val="Hyperlink"/>
-                <w:b/>
-                <w:bCs/>
-                <w:noProof/>
-              </w:rPr>
-              <w:t>KRISTEN</w:t>
+                <w:noProof/>
+              </w:rPr>
+              <w:t>Staff Documents (Kristen)</w:t>
             </w:r>
             <w:r>
               <w:rPr>
@@ -1677,7 +1675,7 @@
                 <w:noProof/>
                 <w:webHidden/>
               </w:rPr>
-              <w:instrText xml:space="preserve"> PAGEREF _Toc239423705 \h </w:instrText>
+              <w:instrText xml:space="preserve"> PAGEREF _Toc239427701 \h </w:instrText>
             </w:r>
             <w:r>
               <w:rPr>
@@ -1722,15 +1720,13 @@
               <w:lang w:eastAsia="en-ZA"/>
             </w:rPr>
           </w:pPr>
-          <w:hyperlink w:anchor="_Toc239423706" w:history="1">
+          <w:hyperlink w:anchor="_Toc239427702" w:history="1">
             <w:r>
               <w:rPr>
                 <w:rStyle w:val="Hyperlink"/>
-                <w:b/>
-                <w:bCs/>
-                <w:noProof/>
-              </w:rPr>
-              <w:t>Thami</w:t>
+                <w:noProof/>
+              </w:rPr>
+              <w:t>Docker (Thami)</w:t>
             </w:r>
             <w:r>
               <w:rPr>
@@ -1751,7 +1747,7 @@
                 <w:noProof/>
                 <w:webHidden/>
               </w:rPr>
-              <w:instrText xml:space="preserve"> PAGEREF _Toc239423706 \h </w:instrText>
+              <w:instrText xml:space="preserve"> PAGEREF _Toc239427702 \h </w:instrText>
             </w:r>
             <w:r>
               <w:rPr>
@@ -1796,7 +1792,7 @@
               <w:lang w:eastAsia="en-ZA"/>
             </w:rPr>
           </w:pPr>
-          <w:hyperlink w:anchor="_Toc239423707" w:history="1">
+          <w:hyperlink w:anchor="_Toc239427703" w:history="1">
             <w:r>
               <w:rPr>
                 <w:rStyle w:val="Hyperlink"/>
@@ -1825,7 +1821,7 @@
                 <w:noProof/>
                 <w:webHidden/>
               </w:rPr>
-              <w:instrText xml:space="preserve"> PAGEREF _Toc239423707 \h </w:instrText>
+              <w:instrText xml:space="preserve"> PAGEREF _Toc239427703 \h </w:instrText>
             </w:r>
             <w:r>
               <w:rPr>
@@ -1870,7 +1866,7 @@
               <w:lang w:eastAsia="en-ZA"/>
             </w:rPr>
           </w:pPr>
-          <w:hyperlink w:anchor="_Toc239423708" w:history="1">
+          <w:hyperlink w:anchor="_Toc239427704" w:history="1">
             <w:r>
               <w:rPr>
                 <w:rStyle w:val="Hyperlink"/>
@@ -1899,7 +1895,7 @@
                 <w:noProof/>
                 <w:webHidden/>
               </w:rPr>
-              <w:instrText xml:space="preserve"> PAGEREF _Toc239423708 \h </w:instrText>
+              <w:instrText xml:space="preserve"> PAGEREF _Toc239427704 \h </w:instrText>
             </w:r>
             <w:r>
               <w:rPr>
@@ -1944,7 +1940,7 @@
               <w:lang w:eastAsia="en-ZA"/>
             </w:rPr>
           </w:pPr>
-          <w:hyperlink w:anchor="_Toc239423709" w:history="1">
+          <w:hyperlink w:anchor="_Toc239427705" w:history="1">
             <w:r>
               <w:rPr>
                 <w:rStyle w:val="Hyperlink"/>
@@ -1973,7 +1969,7 @@
                 <w:noProof/>
                 <w:webHidden/>
               </w:rPr>
-              <w:instrText xml:space="preserve"> PAGEREF _Toc239423709 \h </w:instrText>
+              <w:instrText xml:space="preserve"> PAGEREF _Toc239427705 \h </w:instrText>
             </w:r>
             <w:r>
               <w:rPr>
@@ -1993,7 +1989,7 @@
                 <w:noProof/>
                 <w:webHidden/>
               </w:rPr>
-              <w:t>5</w:t>
+              <w:t>6</w:t>
             </w:r>
             <w:r>
               <w:rPr>
@@ -2018,7 +2014,7 @@
               <w:lang w:eastAsia="en-ZA"/>
             </w:rPr>
           </w:pPr>
-          <w:hyperlink w:anchor="_Toc239423710" w:history="1">
+          <w:hyperlink w:anchor="_Toc239427706" w:history="1">
             <w:r>
               <w:rPr>
                 <w:rStyle w:val="Hyperlink"/>
@@ -2054,7 +2050,7 @@
                 <w:noProof/>
                 <w:webHidden/>
               </w:rPr>
-              <w:instrText xml:space="preserve"> PAGEREF _Toc239423710 \h </w:instrText>
+              <w:instrText xml:space="preserve"> PAGEREF _Toc239427706 \h </w:instrText>
             </w:r>
             <w:r>
               <w:rPr>
@@ -2074,7 +2070,7 @@
                 <w:noProof/>
                 <w:webHidden/>
               </w:rPr>
-              <w:t>5</w:t>
+              <w:t>6</w:t>
             </w:r>
             <w:r>
               <w:rPr>
@@ -2099,7 +2095,7 @@
               <w:lang w:eastAsia="en-ZA"/>
             </w:rPr>
           </w:pPr>
-          <w:hyperlink w:anchor="_Toc239423711" w:history="1">
+          <w:hyperlink w:anchor="_Toc239427707" w:history="1">
             <w:r>
               <w:rPr>
                 <w:rStyle w:val="Hyperlink"/>
@@ -2128,7 +2124,7 @@
                 <w:noProof/>
                 <w:webHidden/>
               </w:rPr>
-              <w:instrText xml:space="preserve"> PAGEREF _Toc239423711 \h </w:instrText>
+              <w:instrText xml:space="preserve"> PAGEREF _Toc239427707 \h </w:instrText>
             </w:r>
             <w:r>
               <w:rPr>
@@ -2148,7 +2144,7 @@
                 <w:noProof/>
                 <w:webHidden/>
               </w:rPr>
-              <w:t>6</w:t>
+              <w:t>8</w:t>
             </w:r>
             <w:r>
               <w:rPr>
@@ -2173,7 +2169,7 @@
               <w:lang w:eastAsia="en-ZA"/>
             </w:rPr>
           </w:pPr>
-          <w:hyperlink w:anchor="_Toc239423712" w:history="1">
+          <w:hyperlink w:anchor="_Toc239427708" w:history="1">
             <w:r>
               <w:rPr>
                 <w:rStyle w:val="Hyperlink"/>
@@ -2202,7 +2198,7 @@
                 <w:noProof/>
                 <w:webHidden/>
               </w:rPr>
-              <w:instrText xml:space="preserve"> PAGEREF _Toc239423712 \h </w:instrText>
+              <w:instrText xml:space="preserve"> PAGEREF _Toc239427708 \h </w:instrText>
             </w:r>
             <w:r>
               <w:rPr>
@@ -2222,81 +2218,7 @@
                 <w:noProof/>
                 <w:webHidden/>
               </w:rPr>
-              <w:t>7</w:t>
-            </w:r>
-            <w:r>
-              <w:rPr>
-                <w:noProof/>
-                <w:webHidden/>
-              </w:rPr>
-              <w:fldChar w:fldCharType="end"/>
-            </w:r>
-          </w:hyperlink>
-        </w:p>
-        <w:p>
-          <w:pPr>
-            <w:pStyle w:val="TOC2"/>
-            <w:tabs>
-              <w:tab w:val="right" w:leader="dot" w:pos="9016"/>
-            </w:tabs>
-            <w:rPr>
-              <w:rFonts w:eastAsiaTheme="minorEastAsia"/>
-              <w:noProof/>
-              <w:sz w:val="24"/>
-              <w:szCs w:val="24"/>
-              <w:lang w:eastAsia="en-ZA"/>
-            </w:rPr>
-          </w:pPr>
-          <w:hyperlink w:anchor="_Toc239423713" w:history="1">
-            <w:r>
-              <w:rPr>
-                <w:rStyle w:val="Hyperlink"/>
-                <w:b/>
-                <w:bCs/>
-                <w:noProof/>
-              </w:rPr>
-              <w:t>Staff Documents Testing Evidence (Kristen):</w:t>
-            </w:r>
-            <w:r>
-              <w:rPr>
-                <w:noProof/>
-                <w:webHidden/>
-              </w:rPr>
-              <w:tab/>
-            </w:r>
-            <w:r>
-              <w:rPr>
-                <w:noProof/>
-                <w:webHidden/>
-              </w:rPr>
-              <w:fldChar w:fldCharType="begin"/>
-            </w:r>
-            <w:r>
-              <w:rPr>
-                <w:noProof/>
-                <w:webHidden/>
-              </w:rPr>
-              <w:instrText xml:space="preserve"> PAGEREF _Toc239423713 \h </w:instrText>
-            </w:r>
-            <w:r>
-              <w:rPr>
-                <w:noProof/>
-                <w:webHidden/>
-              </w:rPr>
-            </w:r>
-            <w:r>
-              <w:rPr>
-                <w:noProof/>
-                <w:webHidden/>
-              </w:rPr>
-              <w:fldChar w:fldCharType="separate"/>
-            </w:r>
-            <w:r>
-              <w:rPr>
-                <w:noProof/>
-                <w:webHidden/>
-              </w:rPr>
-              <w:t>8</w:t>
+              <w:t>9</w:t>
             </w:r>
             <w:r>
               <w:rPr>
@@ -2321,7 +2243,7 @@
               <w:lang w:eastAsia="en-ZA"/>
             </w:rPr>
           </w:pPr>
-          <w:hyperlink w:anchor="_Toc239423714" w:history="1">
+          <w:hyperlink w:anchor="_Toc239427709" w:history="1">
             <w:r>
               <w:rPr>
                 <w:rStyle w:val="Hyperlink"/>
@@ -2348,7 +2270,7 @@
                 <w:noProof/>
                 <w:webHidden/>
               </w:rPr>
-              <w:instrText xml:space="preserve"> PAGEREF _Toc239423714 \h </w:instrText>
+              <w:instrText xml:space="preserve"> PAGEREF _Toc239427709 \h </w:instrText>
             </w:r>
             <w:r>
               <w:rPr>
@@ -2368,7 +2290,7 @@
                 <w:noProof/>
                 <w:webHidden/>
               </w:rPr>
-              <w:t>9</w:t>
+              <w:t>10</w:t>
             </w:r>
             <w:r>
               <w:rPr>
@@ -2400,7 +2322,7 @@
       <w:pPr>
         <w:pStyle w:val="Heading1"/>
       </w:pPr>
-      <w:bookmarkStart w:id="0" w:name="_Toc239423700"/>
+      <w:bookmarkStart w:id="0" w:name="_Toc239427696"/>
       <w:r>
         <w:lastRenderedPageBreak/>
         <w:t>YouTube and GitHub link:</w:t>
@@ -2412,7 +2334,7 @@
       <w:pPr>
         <w:pStyle w:val="Heading2"/>
       </w:pPr>
-      <w:bookmarkStart w:id="1" w:name="_Toc239423701"/>
+      <w:bookmarkStart w:id="1" w:name="_Toc239427697"/>
       <w:r>
         <w:t>YouTube Link:</w:t>
       </w:r>
@@ -2424,7 +2346,7 @@
       <w:pPr>
         <w:pStyle w:val="Heading2"/>
       </w:pPr>
-      <w:bookmarkStart w:id="2" w:name="_Toc239423702"/>
+      <w:bookmarkStart w:id="2" w:name="_Toc239427698"/>
       <w:r>
         <w:t>GitHub Link:</w:t>
       </w:r>
@@ -2444,7 +2366,7 @@
           <w:bCs/>
         </w:rPr>
       </w:pPr>
-      <w:bookmarkStart w:id="3" w:name="_Toc239423703"/>
+      <w:bookmarkStart w:id="3" w:name="_Toc239427699"/>
       <w:r>
         <w:rPr>
           <w:b/>
@@ -3002,7 +2924,7 @@
       <w:pPr>
         <w:pStyle w:val="Heading2"/>
       </w:pPr>
-      <w:bookmarkStart w:id="4" w:name="_Toc239423704"/>
+      <w:bookmarkStart w:id="4" w:name="_Toc239427700"/>
       <w:r>
         <w:t>Menu Management (Kandyce)</w:t>
       </w:r>
@@ -3169,36 +3091,95 @@
     <w:p>
       <w:pPr>
         <w:pStyle w:val="Heading2"/>
-        <w:rPr>
-          <w:b/>
-          <w:bCs/>
-        </w:rPr>
       </w:pPr>
-      <w:bookmarkStart w:id="5" w:name="_Toc239423705"/>
-      <w:r>
-        <w:rPr>
-          <w:b/>
-          <w:bCs/>
-        </w:rPr>
-        <w:t>KRISTEN</w:t>
+      <w:bookmarkStart w:id="5" w:name="_Toc239427701"/>
+      <w:r>
+        <w:t>Staff</w:t>
+      </w:r>
+      <w:r>
+        <w:t xml:space="preserve"> </w:t>
+      </w:r>
+      <w:r>
+        <w:t>Documents</w:t>
+      </w:r>
+      <w:r>
+        <w:t xml:space="preserve"> (</w:t>
+      </w:r>
+      <w:r>
+        <w:t>Kristen</w:t>
+      </w:r>
+      <w:r>
+        <w:t>)</w:t>
       </w:r>
       <w:bookmarkEnd w:id="5"/>
     </w:p>
     <w:p>
       <w:r>
-        <w:t>References</w:t>
-      </w:r>
-      <w:r>
-        <w:t>:</w:t>
-      </w:r>
-    </w:p>
-    <w:p>
+        <w:t xml:space="preserve">The Staff Documents feature allows the canteen staff to upload, view and download important documents using Azure Blob Storage. When a file is uploaded the system checks that it's either a PDF, PNG or JPEG before storing it, so other file types can't be uploaded by mistake </w:t>
+      </w:r>
+      <w:sdt>
+        <w:sdtPr>
+          <w:id w:val="612016295"/>
+          <w:citation/>
+        </w:sdtPr>
+        <w:sdtContent>
+          <w:r>
+            <w:fldChar w:fldCharType="begin"/>
+          </w:r>
+          <w:r>
+            <w:instrText xml:space="preserve"> CITATION Mic6f1 \l 7177 </w:instrText>
+          </w:r>
+          <w:r>
+            <w:fldChar w:fldCharType="separate"/>
+          </w:r>
+          <w:r>
+            <w:rPr>
+              <w:noProof/>
+            </w:rPr>
+            <w:t>(Microsoft Learn, 2026f)</w:t>
+          </w:r>
+          <w:r>
+            <w:fldChar w:fldCharType="end"/>
+          </w:r>
+        </w:sdtContent>
+      </w:sdt>
+      <w:r>
+        <w:t xml:space="preserve">. All the uploaded documents are stored in a container called "staff-docs" and users can list every file that's currently stored, along with its name, size and the date it was last modified </w:t>
+      </w:r>
+      <w:sdt>
+        <w:sdtPr>
+          <w:id w:val="-929119347"/>
+          <w:citation/>
+        </w:sdtPr>
+        <w:sdtContent>
+          <w:r>
+            <w:fldChar w:fldCharType="begin"/>
+          </w:r>
+          <w:r>
+            <w:instrText xml:space="preserve"> CITATION Mic6e1 \l 7177 </w:instrText>
+          </w:r>
+          <w:r>
+            <w:fldChar w:fldCharType="separate"/>
+          </w:r>
+          <w:r>
+            <w:rPr>
+              <w:noProof/>
+            </w:rPr>
+            <w:t>(Microsoft Learn, 2026e)</w:t>
+          </w:r>
+          <w:r>
+            <w:fldChar w:fldCharType="end"/>
+          </w:r>
+        </w:sdtContent>
+      </w:sdt>
+      <w:r>
+        <w:t xml:space="preserve">. Files are also downloaded using streaming, which sends the file to the user instead of loading the whole thing into memory first making it more efficient for larger files </w:t>
+      </w:r>
       <w:sdt>
         <w:sdtPr>
           <w:id w:val="-1773160890"/>
           <w:citation/>
         </w:sdtPr>
-        <w:sdtEndPr/>
         <w:sdtContent>
           <w:r>
             <w:fldChar w:fldCharType="begin"/>
@@ -3221,139 +3202,25 @@
         </w:sdtContent>
       </w:sdt>
       <w:r>
-        <w:t xml:space="preserve"> </w:t>
-      </w:r>
-      <w:r>
-        <w:t>–</w:t>
-      </w:r>
-      <w:r>
-        <w:t xml:space="preserve"> </w:t>
-      </w:r>
-      <w:r>
-        <w:t>Download staff document</w:t>
+        <w:t>. Each function also includes error handling and logging so any problems such as a missing file or a storage connection issue are caught and logged instead of crashing the app.</w:t>
       </w:r>
     </w:p>
-    <w:p>
-      <w:sdt>
-        <w:sdtPr>
-          <w:id w:val="-929119347"/>
-          <w:citation/>
-        </w:sdtPr>
-        <w:sdtEndPr/>
-        <w:sdtContent>
-          <w:r>
-            <w:fldChar w:fldCharType="begin"/>
-          </w:r>
-          <w:r>
-            <w:instrText xml:space="preserve"> CITATION Mic6e1 \l 7177 </w:instrText>
-          </w:r>
-          <w:r>
-            <w:fldChar w:fldCharType="separate"/>
-          </w:r>
-          <w:r>
-            <w:rPr>
-              <w:noProof/>
-            </w:rPr>
-            <w:t>(Microsoft Learn, 2026e)</w:t>
-          </w:r>
-          <w:r>
-            <w:fldChar w:fldCharType="end"/>
-          </w:r>
-        </w:sdtContent>
-      </w:sdt>
-      <w:r>
-        <w:t xml:space="preserve"> – List staff document</w:t>
-      </w:r>
-    </w:p>
-    <w:p>
-      <w:sdt>
-        <w:sdtPr>
-          <w:id w:val="612016295"/>
-          <w:citation/>
-        </w:sdtPr>
-        <w:sdtEndPr/>
-        <w:sdtContent>
-          <w:r>
-            <w:fldChar w:fldCharType="begin"/>
-          </w:r>
-          <w:r>
-            <w:instrText xml:space="preserve"> CITATION Mic6f1 \l 7177 </w:instrText>
-          </w:r>
-          <w:r>
-            <w:fldChar w:fldCharType="separate"/>
-          </w:r>
-          <w:r>
-            <w:rPr>
-              <w:noProof/>
-            </w:rPr>
-            <w:t>(Microsoft Learn, 2026f)</w:t>
-          </w:r>
-          <w:r>
-            <w:fldChar w:fldCharType="end"/>
-          </w:r>
-        </w:sdtContent>
-      </w:sdt>
-      <w:r>
-        <w:t xml:space="preserve"> </w:t>
-      </w:r>
-      <w:r>
-        <w:t>–</w:t>
-      </w:r>
-      <w:r>
-        <w:t xml:space="preserve"> </w:t>
-      </w:r>
-      <w:r>
-        <w:t>Upload staff document</w:t>
-      </w:r>
-    </w:p>
-    <w:p>
-      <w:sdt>
-        <w:sdtPr>
-          <w:id w:val="-16164434"/>
-          <w:citation/>
-        </w:sdtPr>
-        <w:sdtEndPr/>
-        <w:sdtContent>
-          <w:r>
-            <w:fldChar w:fldCharType="begin"/>
-          </w:r>
-          <w:r>
-            <w:instrText xml:space="preserve"> CITATION Mic6e1 \l 7177 </w:instrText>
-          </w:r>
-          <w:r>
-            <w:fldChar w:fldCharType="separate"/>
-          </w:r>
-          <w:r>
-            <w:rPr>
-              <w:noProof/>
-            </w:rPr>
-            <w:t>(Microsoft Learn, 2026e)</w:t>
-          </w:r>
-          <w:r>
-            <w:fldChar w:fldCharType="end"/>
-          </w:r>
-        </w:sdtContent>
-      </w:sdt>
-      <w:r>
-        <w:t xml:space="preserve"> - Upload staff document</w:t>
-      </w:r>
-    </w:p>
-    <w:p/>
     <w:p>
       <w:pPr>
         <w:pStyle w:val="Heading2"/>
-        <w:rPr>
-          <w:b/>
-          <w:bCs/>
-        </w:rPr>
       </w:pPr>
-      <w:bookmarkStart w:id="6" w:name="_Toc239423706"/>
-      <w:r>
-        <w:rPr>
-          <w:b/>
-          <w:bCs/>
-        </w:rPr>
+      <w:bookmarkStart w:id="6" w:name="_Toc239427702"/>
+      <w:r>
+        <w:t>Docker</w:t>
+      </w:r>
+      <w:r>
+        <w:t xml:space="preserve"> (</w:t>
+      </w:r>
+      <w:r>
         <w:t>Thami</w:t>
+      </w:r>
+      <w:r>
+        <w:t>)</w:t>
       </w:r>
       <w:bookmarkEnd w:id="6"/>
     </w:p>
@@ -3367,13 +3234,7 @@
         <w:rPr>
           <w:lang w:val="en-US"/>
         </w:rPr>
-        <w:t>My contribution to Part 1 of the POE was the Docker setup. I wrote multi-stage Docker file for the Azure Functions project, the beginning stage used the full .NET 9 SDK image to compile and publish the code, the second stage then copied only the compiled output into the lightweight Azure Functions runtime image, keeping the final image small and clean</w:t>
-      </w:r>
-      <w:r>
-        <w:rPr>
-          <w:lang w:val="en-US"/>
-        </w:rPr>
-        <w:t xml:space="preserve"> </w:t>
+        <w:t xml:space="preserve">My contribution to Part 1 of the POE was the Docker setup. I wrote multi-stage Docker file for the Azure Functions project, the beginning stage used the full .NET 9 SDK image to compile and publish the code, the second stage then copied only the compiled output into the lightweight Azure Functions runtime image, keeping the final image small and clean </w:t>
       </w:r>
       <w:sdt>
         <w:sdtPr>
@@ -3383,6 +3244,7 @@
           <w:id w:val="-1937205787"/>
           <w:citation/>
         </w:sdtPr>
+        <w:sdtEndPr/>
         <w:sdtContent>
           <w:r>
             <w:rPr>
@@ -3427,6 +3289,7 @@
           <w:id w:val="1572621156"/>
           <w:citation/>
         </w:sdtPr>
+        <w:sdtEndPr/>
         <w:sdtContent>
           <w:r>
             <w:rPr>
@@ -3513,6 +3376,7 @@
           <w:id w:val="1678001549"/>
           <w:citation/>
         </w:sdtPr>
+        <w:sdtEndPr/>
         <w:sdtContent>
           <w:r>
             <w:rPr>
@@ -3563,6 +3427,7 @@
           <w:id w:val="-946081997"/>
           <w:citation/>
         </w:sdtPr>
+        <w:sdtEndPr/>
         <w:sdtContent>
           <w:r>
             <w:rPr>
@@ -3607,6 +3472,7 @@
           <w:id w:val="-152375420"/>
           <w:citation/>
         </w:sdtPr>
+        <w:sdtEndPr/>
         <w:sdtContent>
           <w:r>
             <w:rPr>
@@ -3657,6 +3523,7 @@
           <w:id w:val="-1747265548"/>
           <w:citation/>
         </w:sdtPr>
+        <w:sdtEndPr/>
         <w:sdtContent>
           <w:r>
             <w:rPr>
@@ -3735,6 +3602,7 @@
           <w:id w:val="-2016832736"/>
           <w:citation/>
         </w:sdtPr>
+        <w:sdtEndPr/>
         <w:sdtContent>
           <w:r>
             <w:rPr>
@@ -3779,6 +3647,7 @@
           <w:id w:val="502334996"/>
           <w:citation/>
         </w:sdtPr>
+        <w:sdtEndPr/>
         <w:sdtContent>
           <w:r>
             <w:rPr>
@@ -3817,30 +3686,6 @@
       </w:r>
     </w:p>
     <w:p/>
-    <w:p/>
-    <w:p/>
-    <w:p>
-      <w:pPr>
-        <w:rPr>
-          <w:b/>
-          <w:bCs/>
-        </w:rPr>
-      </w:pPr>
-    </w:p>
-    <w:p>
-      <w:pPr>
-        <w:rPr>
-          <w:b/>
-          <w:bCs/>
-        </w:rPr>
-      </w:pPr>
-    </w:p>
-    <w:p/>
-    <w:p>
-      <w:r>
-        <w:br w:type="page"/>
-      </w:r>
-    </w:p>
     <w:p>
       <w:pPr>
         <w:rPr>
@@ -3881,7 +3726,7 @@
         </w:rPr>
         <w:t> </w:t>
       </w:r>
-      <w:bookmarkStart w:id="7" w:name="_Toc239423707"/>
+      <w:bookmarkStart w:id="7" w:name="_Toc239427703"/>
       <w:proofErr w:type="spellStart"/>
       <w:r>
         <w:rPr>
@@ -3966,13 +3811,21 @@
           <w:bCs/>
         </w:rPr>
       </w:pPr>
-      <w:bookmarkStart w:id="8" w:name="_Toc239423708"/>
+      <w:bookmarkStart w:id="8" w:name="_Toc239427704"/>
       <w:r>
         <w:rPr>
           <w:b/>
           <w:bCs/>
         </w:rPr>
-        <w:t>Docker Containers Running</w:t>
+        <w:t>Docke</w:t>
+      </w:r>
+      <w:r>
+        <w:rPr>
+          <w:b/>
+          <w:bCs/>
+        </w:rPr>
+        <w:lastRenderedPageBreak/>
+        <w:t>r Containers Running</w:t>
       </w:r>
       <w:r>
         <w:rPr>
@@ -4048,7 +3901,7 @@
           <w:bCs/>
         </w:rPr>
       </w:pPr>
-      <w:bookmarkStart w:id="9" w:name="_Toc239423709"/>
+      <w:bookmarkStart w:id="9" w:name="_Toc239427705"/>
       <w:r>
         <w:rPr>
           <w:b/>
@@ -4125,7 +3978,7 @@
       <w:pPr>
         <w:pStyle w:val="Heading2"/>
       </w:pPr>
-      <w:bookmarkStart w:id="10" w:name="_Toc239423710"/>
+      <w:bookmarkStart w:id="10" w:name="_Toc239427706"/>
       <w:r>
         <w:rPr>
           <w:b/>
@@ -4256,7 +4109,6 @@
         <w:t>See below:</w:t>
       </w:r>
     </w:p>
-    <w:p/>
     <w:p>
       <w:r>
         <w:rPr>
@@ -4314,7 +4166,7 @@
           <w:bCs/>
         </w:rPr>
       </w:pPr>
-      <w:bookmarkStart w:id="11" w:name="_Toc239423711"/>
+      <w:bookmarkStart w:id="11" w:name="_Toc239427707"/>
       <w:r>
         <w:rPr>
           <w:b/>
@@ -4437,7 +4289,7 @@
           <w:bCs/>
         </w:rPr>
       </w:pPr>
-      <w:bookmarkStart w:id="12" w:name="_Toc239423712"/>
+      <w:bookmarkStart w:id="12" w:name="_Toc239427708"/>
       <w:r>
         <w:rPr>
           <w:b/>
@@ -4553,44 +4405,11 @@
     </w:p>
     <w:p/>
     <w:p>
-      <w:pPr>
-        <w:pStyle w:val="Heading2"/>
-        <w:rPr>
-          <w:b/>
-          <w:bCs/>
-        </w:rPr>
-      </w:pPr>
-      <w:bookmarkStart w:id="13" w:name="_Toc239423713"/>
-      <w:r>
-        <w:rPr>
-          <w:b/>
-          <w:bCs/>
-        </w:rPr>
-        <w:t>Staff Documents Testing Evidence</w:t>
-      </w:r>
-      <w:r>
-        <w:rPr>
-          <w:b/>
-          <w:bCs/>
-        </w:rPr>
-        <w:t xml:space="preserve"> (Kristen)</w:t>
-      </w:r>
-      <w:r>
-        <w:rPr>
-          <w:b/>
-          <w:bCs/>
-        </w:rPr>
-        <w:t>:</w:t>
-      </w:r>
-      <w:bookmarkEnd w:id="13"/>
+      <w:r>
+        <w:br w:type="page"/>
+      </w:r>
     </w:p>
-    <w:p/>
-    <w:p>
-      <w:r>
-        <w:br w:type="page"/>
-      </w:r>
-    </w:p>
-    <w:bookmarkStart w:id="14" w:name="_Toc239423714" w:displacedByCustomXml="next"/>
+    <w:bookmarkStart w:id="13" w:name="_Toc239427709" w:displacedByCustomXml="next"/>
     <w:sdt>
       <w:sdtPr>
         <w:rPr>
@@ -4614,7 +4433,7 @@
           <w:r>
             <w:t>References</w:t>
           </w:r>
-          <w:bookmarkEnd w:id="14"/>
+          <w:bookmarkEnd w:id="13"/>
         </w:p>
         <w:p>
           <w:pPr>

</xml_diff>

<commit_message>
docs: updated Postman menu functions with invalid test data
</commit_message>
<xml_diff>
--- a/docs/Word Document/CLDV6212_Part_1.docx
+++ b/docs/Word Document/CLDV6212_Part_1.docx
@@ -3122,6 +3122,7 @@
           <w:id w:val="612016295"/>
           <w:citation/>
         </w:sdtPr>
+        <w:sdtEndPr/>
         <w:sdtContent>
           <w:r>
             <w:fldChar w:fldCharType="begin"/>
@@ -3151,6 +3152,7 @@
           <w:id w:val="-929119347"/>
           <w:citation/>
         </w:sdtPr>
+        <w:sdtEndPr/>
         <w:sdtContent>
           <w:r>
             <w:fldChar w:fldCharType="begin"/>
@@ -3180,6 +3182,7 @@
           <w:id w:val="-1773160890"/>
           <w:citation/>
         </w:sdtPr>
+        <w:sdtEndPr/>
         <w:sdtContent>
           <w:r>
             <w:fldChar w:fldCharType="begin"/>
@@ -3733,18 +3736,9 @@
           <w:b/>
           <w:bCs/>
         </w:rPr>
-        <w:t>local.</w:t>
-      </w:r>
-      <w:proofErr w:type="gramStart"/>
-      <w:r>
-        <w:rPr>
-          <w:b/>
-          <w:bCs/>
-        </w:rPr>
-        <w:t>settings.json</w:t>
+        <w:t>local.settings.json</w:t>
       </w:r>
       <w:proofErr w:type="spellEnd"/>
-      <w:proofErr w:type="gramEnd"/>
       <w:r>
         <w:rPr>
           <w:b/>
@@ -3817,15 +3811,7 @@
           <w:b/>
           <w:bCs/>
         </w:rPr>
-        <w:t>Docke</w:t>
-      </w:r>
-      <w:r>
-        <w:rPr>
-          <w:b/>
-          <w:bCs/>
-        </w:rPr>
-        <w:lastRenderedPageBreak/>
-        <w:t>r Containers Running</w:t>
+        <w:t>Docker Containers Running</w:t>
       </w:r>
       <w:r>
         <w:rPr>
@@ -3974,6 +3960,7 @@
         </w:drawing>
       </w:r>
     </w:p>
+    <w:p/>
     <w:p>
       <w:pPr>
         <w:pStyle w:val="Heading2"/>
@@ -3991,12 +3978,38 @@
           <w:b/>
           <w:bCs/>
         </w:rPr>
-        <w:t xml:space="preserve"> (Thami)</w:t>
+        <w:t xml:space="preserve"> </w:t>
+      </w:r>
+      <w:r>
+        <w:rPr>
+          <w:b/>
+          <w:bCs/>
+        </w:rPr>
+        <w:t>(Thami)</w:t>
       </w:r>
       <w:r>
         <w:t>:</w:t>
       </w:r>
       <w:bookmarkEnd w:id="10"/>
+    </w:p>
+    <w:p>
+      <w:pPr>
+        <w:pStyle w:val="Heading2"/>
+      </w:pPr>
+      <w:r>
+        <w:rPr>
+          <w:b/>
+          <w:bCs/>
+        </w:rPr>
+        <w:t>Successful test data run</w:t>
+      </w:r>
+      <w:r>
+        <w:rPr>
+          <w:b/>
+          <w:bCs/>
+        </w:rPr>
+        <w:t>:</w:t>
+      </w:r>
     </w:p>
     <w:p>
       <w:r>
@@ -4087,21 +4100,11 @@
       <w:r>
         <w:t xml:space="preserve">Upload staff documents </w:t>
       </w:r>
-      <w:proofErr w:type="gramStart"/>
-      <w:r>
-        <w:t>fails</w:t>
-      </w:r>
-      <w:proofErr w:type="gramEnd"/>
-      <w:r>
-        <w:t xml:space="preserve"> when it is run together with </w:t>
-      </w:r>
-      <w:proofErr w:type="gramStart"/>
-      <w:r>
-        <w:t>everything, but</w:t>
-      </w:r>
-      <w:proofErr w:type="gramEnd"/>
-      <w:r>
-        <w:t xml:space="preserve"> works when it is tested individually. </w:t>
+      <w:r>
+        <w:t>fail</w:t>
+      </w:r>
+      <w:r>
+        <w:t xml:space="preserve"> when it is run together with everything, but works when it is tested individually. </w:t>
       </w:r>
     </w:p>
     <w:p>
@@ -4155,6 +4158,21 @@
             </a:graphic>
           </wp:inline>
         </w:drawing>
+      </w:r>
+    </w:p>
+    <w:p/>
+    <w:p>
+      <w:pPr>
+        <w:pStyle w:val="Heading2"/>
+      </w:pPr>
+      <w:r>
+        <w:t>Invalid</w:t>
+      </w:r>
+      <w:r>
+        <w:t xml:space="preserve"> test data showing </w:t>
+      </w:r>
+      <w:r>
+        <w:t>exception handling on automated run:</w:t>
       </w:r>
     </w:p>
     <w:p/>

</xml_diff>

<commit_message>
docs: Adding YouTube link to word document and adding test documents to docs
</commit_message>
<xml_diff>
--- a/docs/Word Document/CLDV6212_Part_1.docx
+++ b/docs/Word Document/CLDV6212_Part_1.docx
@@ -155,7 +155,6 @@
                                     <w:dataBinding w:prefixMappings="xmlns:ns0='http://purl.org/dc/elements/1.1/' xmlns:ns1='http://schemas.openxmlformats.org/package/2006/metadata/core-properties' " w:xpath="/ns1:coreProperties[1]/ns0:subject[1]" w:storeItemID="{6C3C8BC8-F283-45AE-878A-BAB7291924A1}"/>
                                     <w:text/>
                                   </w:sdtPr>
-                                  <w:sdtEndPr/>
                                   <w:sdtContent>
                                     <w:r>
                                       <w:rPr>
@@ -1007,7 +1006,6 @@
                                     <w:dataBinding w:prefixMappings="xmlns:ns0='http://schemas.openxmlformats.org/officeDocument/2006/extended-properties' " w:xpath="/ns0:Properties[1]/ns0:Company[1]" w:storeItemID="{6668398D-A668-4E3E-A5EB-62B293D839F1}"/>
                                     <w:text/>
                                   </w:sdtPr>
-                                  <w:sdtEndPr/>
                                   <w:sdtContent>
                                     <w:r>
                                       <w:rPr>
@@ -1053,7 +1051,6 @@
                                   <w:dataBinding w:prefixMappings="xmlns:ns0='http://purl.org/dc/elements/1.1/' xmlns:ns1='http://schemas.openxmlformats.org/package/2006/metadata/core-properties' " w:xpath="/ns1:coreProperties[1]/ns1:category[1]" w:storeItemID="{6C3C8BC8-F283-45AE-878A-BAB7291924A1}"/>
                                   <w:text/>
                                 </w:sdtPr>
-                                <w:sdtEndPr/>
                                 <w:sdtContent>
                                   <w:p>
                                     <w:pPr>
@@ -2340,7 +2337,34 @@
       </w:r>
       <w:bookmarkEnd w:id="1"/>
     </w:p>
-    <w:p/>
+    <w:p>
+      <w:pPr>
+        <w:rPr>
+          <w:b/>
+          <w:bCs/>
+        </w:rPr>
+      </w:pPr>
+      <w:hyperlink r:id="rId8" w:history="1">
+        <w:r>
+          <w:rPr>
+            <w:rStyle w:val="Hyperlink"/>
+          </w:rPr>
+          <w:t>https://yout</w:t>
+        </w:r>
+        <w:r>
+          <w:rPr>
+            <w:rStyle w:val="Hyperlink"/>
+          </w:rPr>
+          <w:t>u</w:t>
+        </w:r>
+        <w:r>
+          <w:rPr>
+            <w:rStyle w:val="Hyperlink"/>
+          </w:rPr>
+          <w:t>.be/suzi50aHtrU?si=HFO_WMRrx3LRTdMr</w:t>
+        </w:r>
+      </w:hyperlink>
+    </w:p>
     <w:p/>
     <w:p>
       <w:pPr>
@@ -2956,7 +2980,6 @@
           <w:id w:val="49356181"/>
           <w:citation/>
         </w:sdtPr>
-        <w:sdtEndPr/>
         <w:sdtContent>
           <w:r>
             <w:fldChar w:fldCharType="begin"/>
@@ -2992,7 +3015,6 @@
           <w:id w:val="-216895064"/>
           <w:citation/>
         </w:sdtPr>
-        <w:sdtEndPr/>
         <w:sdtContent>
           <w:r>
             <w:fldChar w:fldCharType="begin"/>
@@ -3028,7 +3050,6 @@
           <w:id w:val="-1028261604"/>
           <w:citation/>
         </w:sdtPr>
-        <w:sdtEndPr/>
         <w:sdtContent>
           <w:r>
             <w:fldChar w:fldCharType="begin"/>
@@ -3058,7 +3079,6 @@
           <w:id w:val="906724845"/>
           <w:citation/>
         </w:sdtPr>
-        <w:sdtEndPr/>
         <w:sdtContent>
           <w:r>
             <w:fldChar w:fldCharType="begin"/>
@@ -3122,7 +3142,6 @@
           <w:id w:val="612016295"/>
           <w:citation/>
         </w:sdtPr>
-        <w:sdtEndPr/>
         <w:sdtContent>
           <w:r>
             <w:fldChar w:fldCharType="begin"/>
@@ -3152,7 +3171,6 @@
           <w:id w:val="-929119347"/>
           <w:citation/>
         </w:sdtPr>
-        <w:sdtEndPr/>
         <w:sdtContent>
           <w:r>
             <w:fldChar w:fldCharType="begin"/>
@@ -3182,7 +3200,6 @@
           <w:id w:val="-1773160890"/>
           <w:citation/>
         </w:sdtPr>
-        <w:sdtEndPr/>
         <w:sdtContent>
           <w:r>
             <w:fldChar w:fldCharType="begin"/>
@@ -3247,7 +3264,6 @@
           <w:id w:val="-1937205787"/>
           <w:citation/>
         </w:sdtPr>
-        <w:sdtEndPr/>
         <w:sdtContent>
           <w:r>
             <w:rPr>
@@ -3292,7 +3308,6 @@
           <w:id w:val="1572621156"/>
           <w:citation/>
         </w:sdtPr>
-        <w:sdtEndPr/>
         <w:sdtContent>
           <w:r>
             <w:rPr>
@@ -3379,7 +3394,6 @@
           <w:id w:val="1678001549"/>
           <w:citation/>
         </w:sdtPr>
-        <w:sdtEndPr/>
         <w:sdtContent>
           <w:r>
             <w:rPr>
@@ -3430,7 +3444,6 @@
           <w:id w:val="-946081997"/>
           <w:citation/>
         </w:sdtPr>
-        <w:sdtEndPr/>
         <w:sdtContent>
           <w:r>
             <w:rPr>
@@ -3475,7 +3488,6 @@
           <w:id w:val="-152375420"/>
           <w:citation/>
         </w:sdtPr>
-        <w:sdtEndPr/>
         <w:sdtContent>
           <w:r>
             <w:rPr>
@@ -3526,7 +3538,6 @@
           <w:id w:val="-1747265548"/>
           <w:citation/>
         </w:sdtPr>
-        <w:sdtEndPr/>
         <w:sdtContent>
           <w:r>
             <w:rPr>
@@ -3605,7 +3616,6 @@
           <w:id w:val="-2016832736"/>
           <w:citation/>
         </w:sdtPr>
-        <w:sdtEndPr/>
         <w:sdtContent>
           <w:r>
             <w:rPr>
@@ -3650,7 +3660,6 @@
           <w:id w:val="502334996"/>
           <w:citation/>
         </w:sdtPr>
-        <w:sdtEndPr/>
         <w:sdtContent>
           <w:r>
             <w:rPr>
@@ -3736,9 +3745,18 @@
           <w:b/>
           <w:bCs/>
         </w:rPr>
-        <w:t>local.settings.json</w:t>
+        <w:t>local.</w:t>
+      </w:r>
+      <w:proofErr w:type="gramStart"/>
+      <w:r>
+        <w:rPr>
+          <w:b/>
+          <w:bCs/>
+        </w:rPr>
+        <w:t>settings.json</w:t>
       </w:r>
       <w:proofErr w:type="spellEnd"/>
+      <w:proofErr w:type="gramEnd"/>
       <w:r>
         <w:rPr>
           <w:b/>
@@ -3769,7 +3787,7 @@
                     <pic:cNvPicPr/>
                   </pic:nvPicPr>
                   <pic:blipFill>
-                    <a:blip r:embed="rId8">
+                    <a:blip r:embed="rId9">
                       <a:extLst>
                         <a:ext uri="{28A0092B-C50C-407E-A947-70E740481C1C}">
                           <a14:useLocalDpi xmlns:a14="http://schemas.microsoft.com/office/drawing/2010/main" val="0"/>
@@ -3850,7 +3868,7 @@
                     <pic:cNvPicPr/>
                   </pic:nvPicPr>
                   <pic:blipFill>
-                    <a:blip r:embed="rId9">
+                    <a:blip r:embed="rId10">
                       <a:extLst>
                         <a:ext uri="{28A0092B-C50C-407E-A947-70E740481C1C}">
                           <a14:useLocalDpi xmlns:a14="http://schemas.microsoft.com/office/drawing/2010/main" val="0"/>
@@ -3933,7 +3951,7 @@
                     <pic:cNvPicPr/>
                   </pic:nvPicPr>
                   <pic:blipFill>
-                    <a:blip r:embed="rId10">
+                    <a:blip r:embed="rId11">
                       <a:extLst>
                         <a:ext uri="{28A0092B-C50C-407E-A947-70E740481C1C}">
                           <a14:useLocalDpi xmlns:a14="http://schemas.microsoft.com/office/drawing/2010/main" val="0"/>
@@ -4001,14 +4019,7 @@
           <w:b/>
           <w:bCs/>
         </w:rPr>
-        <w:t>Successful test data run</w:t>
-      </w:r>
-      <w:r>
-        <w:rPr>
-          <w:b/>
-          <w:bCs/>
-        </w:rPr>
-        <w:t>:</w:t>
+        <w:t>Successful test data run:</w:t>
       </w:r>
     </w:p>
     <w:p>
@@ -4032,7 +4043,7 @@
                     <pic:cNvPicPr/>
                   </pic:nvPicPr>
                   <pic:blipFill>
-                    <a:blip r:embed="rId11"/>
+                    <a:blip r:embed="rId12"/>
                     <a:stretch>
                       <a:fillRect/>
                     </a:stretch>
@@ -4075,7 +4086,7 @@
                     <pic:cNvPicPr/>
                   </pic:nvPicPr>
                   <pic:blipFill>
-                    <a:blip r:embed="rId12"/>
+                    <a:blip r:embed="rId13"/>
                     <a:stretch>
                       <a:fillRect/>
                     </a:stretch>
@@ -4104,7 +4115,15 @@
         <w:t>fail</w:t>
       </w:r>
       <w:r>
-        <w:t xml:space="preserve"> when it is run together with everything, but works when it is tested individually. </w:t>
+        <w:t xml:space="preserve"> when it is run together with </w:t>
+      </w:r>
+      <w:proofErr w:type="gramStart"/>
+      <w:r>
+        <w:t>everything, but</w:t>
+      </w:r>
+      <w:proofErr w:type="gramEnd"/>
+      <w:r>
+        <w:t xml:space="preserve"> works when it is tested individually. </w:t>
       </w:r>
     </w:p>
     <w:p>
@@ -4133,7 +4152,7 @@
                     <pic:cNvPicPr/>
                   </pic:nvPicPr>
                   <pic:blipFill>
-                    <a:blip r:embed="rId13">
+                    <a:blip r:embed="rId14">
                       <a:extLst>
                         <a:ext uri="{28A0092B-C50C-407E-A947-70E740481C1C}">
                           <a14:useLocalDpi xmlns:a14="http://schemas.microsoft.com/office/drawing/2010/main" val="0"/>
@@ -4223,7 +4242,7 @@
                     <pic:cNvPicPr/>
                   </pic:nvPicPr>
                   <pic:blipFill>
-                    <a:blip r:embed="rId14">
+                    <a:blip r:embed="rId15">
                       <a:extLst>
                         <a:ext uri="{28A0092B-C50C-407E-A947-70E740481C1C}">
                           <a14:useLocalDpi xmlns:a14="http://schemas.microsoft.com/office/drawing/2010/main" val="0"/>
@@ -4271,7 +4290,7 @@
                     <pic:cNvPicPr/>
                   </pic:nvPicPr>
                   <pic:blipFill>
-                    <a:blip r:embed="rId15">
+                    <a:blip r:embed="rId16">
                       <a:extLst>
                         <a:ext uri="{28A0092B-C50C-407E-A947-70E740481C1C}">
                           <a14:useLocalDpi xmlns:a14="http://schemas.microsoft.com/office/drawing/2010/main" val="0"/>
@@ -4346,7 +4365,7 @@
                     <pic:cNvPicPr/>
                   </pic:nvPicPr>
                   <pic:blipFill>
-                    <a:blip r:embed="rId16">
+                    <a:blip r:embed="rId17">
                       <a:extLst>
                         <a:ext uri="{28A0092B-C50C-407E-A947-70E740481C1C}">
                           <a14:useLocalDpi xmlns:a14="http://schemas.microsoft.com/office/drawing/2010/main" val="0"/>
@@ -4394,7 +4413,7 @@
                     <pic:cNvPicPr/>
                   </pic:nvPicPr>
                   <pic:blipFill>
-                    <a:blip r:embed="rId17">
+                    <a:blip r:embed="rId18">
                       <a:extLst>
                         <a:ext uri="{28A0092B-C50C-407E-A947-70E740481C1C}">
                           <a14:useLocalDpi xmlns:a14="http://schemas.microsoft.com/office/drawing/2010/main" val="0"/>
@@ -4442,7 +4461,6 @@
           <w:docPartUnique/>
         </w:docPartObj>
       </w:sdtPr>
-      <w:sdtEndPr/>
       <w:sdtContent>
         <w:p>
           <w:pPr>
@@ -4491,7 +4509,7 @@
             <w:br/>
             <w:t xml:space="preserve">Available at: </w:t>
           </w:r>
-          <w:hyperlink r:id="rId18" w:history="1">
+          <w:hyperlink r:id="rId19" w:history="1">
             <w:r>
               <w:rPr>
                 <w:rStyle w:val="Hyperlink"/>
@@ -4542,7 +4560,7 @@
             <w:br/>
             <w:t xml:space="preserve">Available at: </w:t>
           </w:r>
-          <w:hyperlink r:id="rId19" w:history="1">
+          <w:hyperlink r:id="rId20" w:history="1">
             <w:r>
               <w:rPr>
                 <w:rStyle w:val="Hyperlink"/>
@@ -4593,7 +4611,7 @@
             <w:br/>
             <w:t xml:space="preserve">Available at: </w:t>
           </w:r>
-          <w:hyperlink r:id="rId20" w:history="1">
+          <w:hyperlink r:id="rId21" w:history="1">
             <w:r>
               <w:rPr>
                 <w:rStyle w:val="Hyperlink"/>
@@ -4644,7 +4662,7 @@
             <w:br/>
             <w:t xml:space="preserve">Available at: </w:t>
           </w:r>
-          <w:hyperlink r:id="rId21" w:history="1">
+          <w:hyperlink r:id="rId22" w:history="1">
             <w:r>
               <w:rPr>
                 <w:rStyle w:val="Hyperlink"/>
@@ -4695,7 +4713,7 @@
             <w:br/>
             <w:t xml:space="preserve">Available at: </w:t>
           </w:r>
-          <w:hyperlink r:id="rId22" w:history="1">
+          <w:hyperlink r:id="rId23" w:history="1">
             <w:r>
               <w:rPr>
                 <w:rStyle w:val="Hyperlink"/>
@@ -4746,7 +4764,7 @@
             <w:br/>
             <w:t xml:space="preserve">Available at: </w:t>
           </w:r>
-          <w:hyperlink r:id="rId23" w:history="1">
+          <w:hyperlink r:id="rId24" w:history="1">
             <w:r>
               <w:rPr>
                 <w:rStyle w:val="Hyperlink"/>
@@ -4797,7 +4815,7 @@
             <w:br/>
             <w:t xml:space="preserve">Available at: </w:t>
           </w:r>
-          <w:hyperlink r:id="rId24" w:history="1">
+          <w:hyperlink r:id="rId25" w:history="1">
             <w:r>
               <w:rPr>
                 <w:rStyle w:val="Hyperlink"/>
@@ -4848,7 +4866,7 @@
             <w:br/>
             <w:t xml:space="preserve">Available at: </w:t>
           </w:r>
-          <w:hyperlink r:id="rId25" w:history="1">
+          <w:hyperlink r:id="rId26" w:history="1">
             <w:r>
               <w:rPr>
                 <w:rStyle w:val="Hyperlink"/>
@@ -4899,7 +4917,7 @@
             <w:br/>
             <w:t xml:space="preserve">Available at: </w:t>
           </w:r>
-          <w:hyperlink r:id="rId26" w:history="1">
+          <w:hyperlink r:id="rId27" w:history="1">
             <w:r>
               <w:rPr>
                 <w:rStyle w:val="Hyperlink"/>
@@ -4950,7 +4968,7 @@
             <w:br/>
             <w:t xml:space="preserve">Available at: </w:t>
           </w:r>
-          <w:hyperlink r:id="rId27" w:history="1">
+          <w:hyperlink r:id="rId28" w:history="1">
             <w:r>
               <w:rPr>
                 <w:rStyle w:val="Hyperlink"/>
@@ -5001,7 +5019,7 @@
             <w:br/>
             <w:t xml:space="preserve">Available at: </w:t>
           </w:r>
-          <w:hyperlink r:id="rId28" w:history="1">
+          <w:hyperlink r:id="rId29" w:history="1">
             <w:r>
               <w:rPr>
                 <w:rStyle w:val="Hyperlink"/>
@@ -5053,7 +5071,7 @@
             <w:br/>
             <w:t xml:space="preserve">Available at: </w:t>
           </w:r>
-          <w:hyperlink r:id="rId29" w:history="1">
+          <w:hyperlink r:id="rId30" w:history="1">
             <w:r>
               <w:rPr>
                 <w:rStyle w:val="Hyperlink"/>
@@ -5104,7 +5122,7 @@
             <w:br/>
             <w:t xml:space="preserve">Available at: </w:t>
           </w:r>
-          <w:hyperlink r:id="rId30" w:history="1">
+          <w:hyperlink r:id="rId31" w:history="1">
             <w:r>
               <w:rPr>
                 <w:rStyle w:val="Hyperlink"/>
@@ -5126,7 +5144,7 @@
     </w:sdt>
     <w:p/>
     <w:sectPr>
-      <w:footerReference w:type="default" r:id="rId31"/>
+      <w:footerReference w:type="default" r:id="rId32"/>
       <w:pgSz w:w="11906" w:h="16838"/>
       <w:pgMar w:top="1440" w:right="1440" w:bottom="1440" w:left="1440" w:header="708" w:footer="708" w:gutter="0"/>
       <w:pgNumType w:start="0"/>
@@ -6103,7 +6121,6 @@
   <w:style w:type="character" w:default="1" w:styleId="DefaultParagraphFont">
     <w:name w:val="Default Paragraph Font"/>
     <w:uiPriority w:val="1"/>
-    <w:semiHidden/>
     <w:unhideWhenUsed/>
   </w:style>
   <w:style w:type="table" w:default="1" w:styleId="TableNormal">
@@ -6576,6 +6593,18 @@
       <w:rFonts w:ascii="Times New Roman" w:hAnsi="Times New Roman" w:cs="Times New Roman"/>
       <w:sz w:val="24"/>
       <w:szCs w:val="24"/>
+    </w:rPr>
+  </w:style>
+  <w:style w:type="character" w:styleId="FollowedHyperlink">
+    <w:name w:val="FollowedHyperlink"/>
+    <w:basedOn w:val="DefaultParagraphFont"/>
+    <w:uiPriority w:val="99"/>
+    <w:semiHidden/>
+    <w:unhideWhenUsed/>
+    <w:rsid w:val="00736011"/>
+    <w:rPr>
+      <w:color w:val="96607D" w:themeColor="followedHyperlink"/>
+      <w:u w:val="single"/>
     </w:rPr>
   </w:style>
 </w:styles>

</xml_diff>